<commit_message>
Update Netflix RFP response with Dentons KMN firm details and pricing model
- Relationship Partner, billing manager, firm name and Douala address added
- Team remapped to the firm's five practice groups (Corporate/M&A,
  Energy & PPP, Banking & Finance, Compliance, Legal Advisory) with
  patent prosecution via the Dentons network
- Tiered rate card replaced by a single USD 450 hourly rate; fixed fees
  quoted per scope of work; subscription bands sized to the client
- Translation desk repositioned around English-French in-house capacity
- Legal Tracker, conflicts and Q&A items marked complete; rankings,
  diversity statistics, certifications and insurance left as in-progress

Co-Authored-By: Claude Fable 5.1 <noreply@anthropic.com>
Claude-Session: https://claude.ai/code/session_01SkrgUhiyWm1hc1GFG2EUss
</commit_message>
<xml_diff>
--- a/Netflix_RFP_2026/Dentons_KMN_Netflix_Product_Tech_RFP_Response_2026.docx
+++ b/Netflix_RFP_2026/Dentons_KMN_Netflix_Product_Tech_RFP_Response_2026.docx
@@ -47,7 +47,7 @@
           <w:sz w:val="22"/>
           <w:szCs w:val="22"/>
         </w:rPr>
-        <w:t xml:space="preserve">A member of the Dentons global network</w:t>
+        <w:t xml:space="preserve">Kouengoua Minou Nkongho  ·  Attorneys at Law  ·  A member of the Dentons global network</w:t>
       </w:r>
     </w:p>
     <w:tbl>
@@ -422,43 +422,8 @@
                 <w:rFonts w:ascii="Arial" w:cs="Arial" w:eastAsia="Arial" w:hAnsi="Arial"/>
                 <w:sz w:val="19"/>
                 <w:szCs w:val="19"/>
-                <w:shd w:fill="FFF200" w:color="auto" w:val="clear"/>
-              </w:rPr>
-              <w:t xml:space="preserve">[Relationship Partner name]</w:t>
-            </w:r>
-            <w:r>
-              <w:rPr>
-                <w:rFonts w:ascii="Arial" w:cs="Arial" w:eastAsia="Arial" w:hAnsi="Arial"/>
-                <w:sz w:val="19"/>
-                <w:szCs w:val="19"/>
-              </w:rPr>
-              <w:t xml:space="preserve"> · </w:t>
-            </w:r>
-            <w:r>
-              <w:rPr>
-                <w:rFonts w:ascii="Arial" w:cs="Arial" w:eastAsia="Arial" w:hAnsi="Arial"/>
-                <w:sz w:val="19"/>
-                <w:szCs w:val="19"/>
-                <w:shd w:fill="FFF200" w:color="auto" w:val="clear"/>
-              </w:rPr>
-              <w:t xml:space="preserve">[email@dentons.com]</w:t>
-            </w:r>
-            <w:r>
-              <w:rPr>
-                <w:rFonts w:ascii="Arial" w:cs="Arial" w:eastAsia="Arial" w:hAnsi="Arial"/>
-                <w:sz w:val="19"/>
-                <w:szCs w:val="19"/>
-              </w:rPr>
-              <w:t xml:space="preserve"> · </w:t>
-            </w:r>
-            <w:r>
-              <w:rPr>
-                <w:rFonts w:ascii="Arial" w:cs="Arial" w:eastAsia="Arial" w:hAnsi="Arial"/>
-                <w:sz w:val="19"/>
-                <w:szCs w:val="19"/>
-                <w:shd w:fill="FFF200" w:color="auto" w:val="clear"/>
-              </w:rPr>
-              <w:t xml:space="preserve">[+00 000 000 0000]</w:t>
+              </w:rPr>
+              <w:t xml:space="preserve">Agbor Nkongho · nkongho.agbor@dentons.com · +237 650 73 21 70</w:t>
             </w:r>
           </w:p>
         </w:tc>
@@ -725,7 +690,7 @@
           <w:sz w:val="21"/>
           <w:szCs w:val="21"/>
         </w:rPr>
-        <w:t xml:space="preserve"> A single Relationship Partner accountable for the whole engagement, with named leads for privacy, consumer protection and marketing, patents, product contracts and regulatory inquiries, drawing on the Dentons global network for local law input in every market where Netflix operates.</w:t>
+        <w:t xml:space="preserve"> A single Relationship Partner accountable for the whole engagement, with named leads from our Compliance, Legal Advisory, Corporate/M&amp;A, Energy &amp; PPP and Banking &amp; Finance practices mapped to each area of the Netflix scope, and with patent prosecution and local-law input drawn from the Dentons global network in every market where Netflix operates.</w:t>
       </w:r>
     </w:p>
     <w:p>
@@ -781,7 +746,7 @@
           <w:sz w:val="21"/>
           <w:szCs w:val="21"/>
         </w:rPr>
-        <w:t xml:space="preserve"> staffed by multilingual attorneys who work inside Netflix's own translation and localization tools, follow the Netflix glossary, and confine feedback to substantive legal accuracy.</w:t>
+        <w:t xml:space="preserve"> staffed by bilingual English–French attorneys, extended to other languages through the Dentons network, who work inside Netflix's own translation and localization tools, follow the Netflix glossary, and confine feedback to substantive legal accuracy.</w:t>
       </w:r>
     </w:p>
     <w:p>
@@ -809,7 +774,7 @@
           <w:sz w:val="21"/>
           <w:szCs w:val="21"/>
         </w:rPr>
-        <w:t xml:space="preserve"> Discounted rates fixed for three years, a subscription option for day-to-day advisory work, fixed fees for translation, capped fees for product contracts, volume credits, and a portion of our fees placed at risk against agreed performance indicators.</w:t>
+        <w:t xml:space="preserve"> One hourly rate of USD 450 for all lawyer time, fixed for three years; subscription bands for day-to-day advisory work; fixed fees quoted per scope of work; volume credits; and a portion of our fees placed at risk against agreed performance indicators.</w:t>
       </w:r>
     </w:p>
     <w:p>
@@ -851,7 +816,7 @@
           <w:sz w:val="21"/>
           <w:szCs w:val="21"/>
         </w:rPr>
-        <w:t xml:space="preserve">We have reviewed and accept the confidentiality obligations, legal notice, terms and conditions and communication protocol set out in the RFP. We have completed a preliminary conflicts review and have identified no conflict that would prevent us from acting for Netflix on the scope described. We will not seek advance, general or litigation waivers.</w:t>
+        <w:t xml:space="preserve">We have reviewed and accept the confidentiality obligations, legal notice, terms and conditions and communication protocol set out in the RFP. We have completed our conflicts review and have identified no conflict that would prevent us from acting for Netflix on the scope described. We will not seek advance, general or litigation waivers.</w:t>
       </w:r>
     </w:p>
     <w:p>
@@ -899,9 +864,8 @@
           <w:bCs/>
           <w:sz w:val="21"/>
           <w:szCs w:val="21"/>
-          <w:shd w:fill="FFF200" w:color="auto" w:val="clear"/>
-        </w:rPr>
-        <w:t xml:space="preserve">[Relationship Partner name]</w:t>
+        </w:rPr>
+        <w:t xml:space="preserve">Agbor Nkongho</w:t>
       </w:r>
     </w:p>
     <w:p>
@@ -929,16 +893,7 @@
           <w:sz w:val="21"/>
           <w:szCs w:val="21"/>
         </w:rPr>
-        <w:t xml:space="preserve">Dentons KMN · </w:t>
-      </w:r>
-      <w:r>
-        <w:rPr>
-          <w:rFonts w:ascii="Arial" w:cs="Arial" w:eastAsia="Arial" w:hAnsi="Arial"/>
-          <w:sz w:val="21"/>
-          <w:szCs w:val="21"/>
-          <w:shd w:fill="FFF200" w:color="auto" w:val="clear"/>
-        </w:rPr>
-        <w:t xml:space="preserve">[Street address, City, Country]</w:t>
+        <w:t xml:space="preserve">Dentons KMN · P.O. Box 3792, 485 Rue des Ecoles, Akwa, Douala, Cameroon</w:t>
       </w:r>
     </w:p>
     <w:p>
@@ -951,26 +906,8 @@
           <w:rFonts w:ascii="Arial" w:cs="Arial" w:eastAsia="Arial" w:hAnsi="Arial"/>
           <w:sz w:val="21"/>
           <w:szCs w:val="21"/>
-          <w:shd w:fill="FFF200" w:color="auto" w:val="clear"/>
-        </w:rPr>
-        <w:t xml:space="preserve">[email@dentons.com]</w:t>
-      </w:r>
-      <w:r>
-        <w:rPr>
-          <w:rFonts w:ascii="Arial" w:cs="Arial" w:eastAsia="Arial" w:hAnsi="Arial"/>
-          <w:sz w:val="21"/>
-          <w:szCs w:val="21"/>
-        </w:rPr>
-        <w:t xml:space="preserve"> · </w:t>
-      </w:r>
-      <w:r>
-        <w:rPr>
-          <w:rFonts w:ascii="Arial" w:cs="Arial" w:eastAsia="Arial" w:hAnsi="Arial"/>
-          <w:sz w:val="21"/>
-          <w:szCs w:val="21"/>
-          <w:shd w:fill="FFF200" w:color="auto" w:val="clear"/>
-        </w:rPr>
-        <w:t xml:space="preserve">[+00 000 000 0000]</w:t>
+        </w:rPr>
+        <w:t xml:space="preserve">nkongho.agbor@dentons.com · +237 650 73 21 70</w:t>
       </w:r>
     </w:p>
     <w:p>
@@ -1608,7 +1545,7 @@
                 <w:sz w:val="19"/>
                 <w:szCs w:val="19"/>
               </w:rPr>
-              <w:t xml:space="preserve">A dedicated Legal Translation &amp; Localization Desk of multilingual attorneys with a documented QA workflow, glossary governance and a "substantive-only" feedback rule</w:t>
+              <w:t xml:space="preserve">A dedicated Legal Translation &amp; Localization Desk of bilingual English–French attorneys, extended through the Dentons network, with a documented QA workflow, glossary governance and a "substantive-only" feedback rule</w:t>
             </w:r>
           </w:p>
         </w:tc>
@@ -1902,7 +1839,7 @@
                 <w:sz w:val="19"/>
                 <w:szCs w:val="19"/>
               </w:rPr>
-              <w:t xml:space="preserve">Discounted rates fixed for three years, a subscription option, fixed-fee translation, capped-fee contracts, volume credits and a 5% at-risk fee tied to KPIs</w:t>
+              <w:t xml:space="preserve">One hourly rate of USD 450 for all lawyer time, fixed for three years; subscription bands; fixed fees quoted per scope of work; volume credits and a 5% at-risk fee tied to KPIs</w:t>
             </w:r>
           </w:p>
         </w:tc>
@@ -2472,7 +2409,7 @@
                 <w:sz w:val="19"/>
                 <w:szCs w:val="19"/>
               </w:rPr>
-              <w:t xml:space="preserve">Rates fixed for 3 years from 1 January 2027</w:t>
+              <w:t xml:space="preserve">Single hourly rate of USD 450, fixed for 3 years from 1 January 2027</w:t>
             </w:r>
           </w:p>
         </w:tc>
@@ -3390,24 +3327,21 @@
           <w:sz w:val="21"/>
           <w:szCs w:val="21"/>
         </w:rPr>
-        <w:t xml:space="preserve">Dentons KMN is a full-service law firm based in </w:t>
-      </w:r>
-      <w:r>
-        <w:rPr>
-          <w:rFonts w:ascii="Arial" w:cs="Arial" w:eastAsia="Arial" w:hAnsi="Arial"/>
-          <w:sz w:val="21"/>
-          <w:szCs w:val="21"/>
-          <w:shd w:fill="FFF200" w:color="auto" w:val="clear"/>
-        </w:rPr>
-        <w:t xml:space="preserve">[Office city]</w:t>
-      </w:r>
-      <w:r>
-        <w:rPr>
-          <w:rFonts w:ascii="Arial" w:cs="Arial" w:eastAsia="Arial" w:hAnsi="Arial"/>
-          <w:sz w:val="21"/>
-          <w:szCs w:val="21"/>
-        </w:rPr>
-        <w:t xml:space="preserve"> and a member of Dentons, the world's largest law firm by lawyer headcount, with offices in more than 80 countries. Dentons is polycentric by design: there is no single headquarters and no dominant national culture, which means Netflix receives locally qualified advice in each market delivered through a single, globally coordinated team.</w:t>
+        <w:t xml:space="preserve">Dentons KMN (Kouengoua Minou Nkongho), Attorneys at Law, is a full-service law firm based in Douala, Cameroon, and a member of Dentons, the world's largest law firm by lawyer headcount, with offices in more than 80 countries. Our lawyers practise in English and French, in a jurisdiction that combines common-law and civil-law traditions within the OHADA and CEMAC frameworks, which makes the firm a natural bridge between anglophone and francophone legal systems. Dentons is polycentric by design: there is no single headquarters and no dominant national culture, which means Netflix receives locally qualified advice in each market delivered through a single, globally coordinated team.</w:t>
+      </w:r>
+    </w:p>
+    <w:p>
+      <w:pPr>
+        <w:spacing w:after="140" w:line="276"/>
+        <w:jc w:val="left"/>
+      </w:pPr>
+      <w:r>
+        <w:rPr>
+          <w:rFonts w:ascii="Arial" w:cs="Arial" w:eastAsia="Arial" w:hAnsi="Arial"/>
+          <w:sz w:val="21"/>
+          <w:szCs w:val="21"/>
+        </w:rPr>
+        <w:t xml:space="preserve">Dentons KMN is organised around five practice groups: Corporate/M&amp;A, Energy &amp; PPP, Banking &amp; Finance, Compliance, and Legal Advisory. For Netflix, each area of the RFP scope is mapped to the practice group best placed to lead it, with global patent prosecution and additional local-law capacity drawn from the Dentons network.</w:t>
       </w:r>
     </w:p>
     <w:p>
@@ -3467,7 +3401,7 @@
                 <w:sz w:val="19"/>
                 <w:szCs w:val="19"/>
               </w:rPr>
-              <w:t xml:space="preserve">Practice</w:t>
+              <w:t xml:space="preserve">Dentons KMN practice group</w:t>
             </w:r>
           </w:p>
         </w:tc>
@@ -3497,7 +3431,7 @@
                 <w:sz w:val="19"/>
                 <w:szCs w:val="19"/>
               </w:rPr>
-              <w:t xml:space="preserve">Relevance to the Netflix scope</w:t>
+              <w:t xml:space="preserve">Lead role in the Netflix scope</w:t>
             </w:r>
           </w:p>
         </w:tc>
@@ -3529,7 +3463,7 @@
                 <w:sz w:val="19"/>
                 <w:szCs w:val="19"/>
               </w:rPr>
-              <w:t xml:space="preserve">Privacy, Data Protection and Cybersecurity</w:t>
+              <w:t xml:space="preserve">Compliance</w:t>
             </w:r>
           </w:p>
         </w:tc>
@@ -3555,7 +3489,7 @@
                 <w:sz w:val="19"/>
                 <w:szCs w:val="19"/>
               </w:rPr>
-              <w:t xml:space="preserve">Product privacy counselling, DPIAs, transfer mechanisms, regulator engagement, breach response, ad-tech and tracking technologies</w:t>
+              <w:t xml:space="preserve">Data privacy and data protection, consumer protection, marketing and advertising compliance, AI and platform regulation, compliance programmes and regulator engagement</w:t>
             </w:r>
           </w:p>
         </w:tc>
@@ -3588,7 +3522,7 @@
                 <w:sz w:val="19"/>
                 <w:szCs w:val="19"/>
               </w:rPr>
-              <w:t xml:space="preserve">Consumer Protection, Advertising and Marketing</w:t>
+              <w:t xml:space="preserve">Legal Advisory</w:t>
             </w:r>
           </w:p>
         </w:tc>
@@ -3615,7 +3549,7 @@
                 <w:sz w:val="19"/>
                 <w:szCs w:val="19"/>
               </w:rPr>
-              <w:t xml:space="preserve">Subscription and auto-renewal rules, terms of use, promotions and sweepstakes, influencer and claims rules, dark-pattern enforcement trends</w:t>
+              <w:t xml:space="preserve">Day-to-day product and technology advisory, terms of use and policies, the Legal Translation &amp; Localization Desk (English–French and, through the network, other languages), and coordination of IP matters</w:t>
             </w:r>
           </w:p>
         </w:tc>
@@ -3647,7 +3581,7 @@
                 <w:sz w:val="19"/>
                 <w:szCs w:val="19"/>
               </w:rPr>
-              <w:t xml:space="preserve">Intellectual Property and Patents</w:t>
+              <w:t xml:space="preserve">Corporate/M&amp;A</w:t>
             </w:r>
           </w:p>
         </w:tc>
@@ -3673,7 +3607,7 @@
                 <w:sz w:val="19"/>
                 <w:szCs w:val="19"/>
               </w:rPr>
-              <w:t xml:space="preserve">Patent drafting and prosecution, portfolio strategy, freedom-to-operate, standards and licensing for streaming and platform technologies</w:t>
+              <w:t xml:space="preserve">Product contracts, platform and device partnerships, technology licensing, SaaS and cloud procurement, and time-sensitive commercial negotiations</w:t>
             </w:r>
           </w:p>
         </w:tc>
@@ -3706,7 +3640,7 @@
                 <w:sz w:val="19"/>
                 <w:szCs w:val="19"/>
               </w:rPr>
-              <w:t xml:space="preserve">Technology, Media and Telecommunications</w:t>
+              <w:t xml:space="preserve">Energy &amp; PPP</w:t>
             </w:r>
           </w:p>
         </w:tc>
@@ -3733,7 +3667,7 @@
                 <w:sz w:val="19"/>
                 <w:szCs w:val="19"/>
               </w:rPr>
-              <w:t xml:space="preserve">Platform and device partnerships, technology licensing, cloud and SaaS, games distribution, content delivery and telecom regulation</w:t>
+              <w:t xml:space="preserve">Regulatory inquiries, public-sector and government engagement, consultations and coordinated responses to authorities across jurisdictions</w:t>
             </w:r>
           </w:p>
         </w:tc>
@@ -3765,7 +3699,7 @@
                 <w:sz w:val="19"/>
                 <w:szCs w:val="19"/>
               </w:rPr>
-              <w:t xml:space="preserve">Commercial Contracts</w:t>
+              <w:t xml:space="preserve">Banking &amp; Finance</w:t>
             </w:r>
           </w:p>
         </w:tc>
@@ -3791,7 +3725,7 @@
                 <w:sz w:val="19"/>
                 <w:szCs w:val="19"/>
               </w:rPr>
-              <w:t xml:space="preserve">Rapid negotiation support, playbooks, template governance and contract lifecycle discipline</w:t>
+              <w:t xml:space="preserve">Payments, subscription billing, consumer-credit and financial-regulatory aspects of product flows, and fintech partnerships</w:t>
             </w:r>
           </w:p>
         </w:tc>
@@ -3824,7 +3758,7 @@
                 <w:sz w:val="19"/>
                 <w:szCs w:val="19"/>
               </w:rPr>
-              <w:t xml:space="preserve">Regulatory and Government Affairs</w:t>
+              <w:t xml:space="preserve">Dentons global network</w:t>
             </w:r>
           </w:p>
         </w:tc>
@@ -3851,65 +3785,7 @@
                 <w:sz w:val="19"/>
                 <w:szCs w:val="19"/>
               </w:rPr>
-              <w:t xml:space="preserve">Coordinated responses to regulators across jurisdictions, consultations and legislative monitoring</w:t>
-            </w:r>
-          </w:p>
-        </w:tc>
-      </w:tr>
-      <w:tr>
-        <w:trPr>
-          <w:cantSplit/>
-          <w:tblHeader w:val="false"/>
-        </w:trPr>
-        <w:tc>
-          <w:tcPr>
-            <w:tcW w:type="dxa" w:w="3200"/>
-            <w:tcMar>
-              <w:top w:type="dxa" w:w="70"/>
-              <w:left w:type="dxa" w:w="110"/>
-              <w:bottom w:type="dxa" w:w="70"/>
-              <w:right w:type="dxa" w:w="110"/>
-            </w:tcMar>
-            <w:vAlign w:val="top"/>
-          </w:tcPr>
-          <w:p>
-            <w:pPr>
-              <w:spacing w:after="40" w:line="252"/>
-              <w:jc w:val="left"/>
-            </w:pPr>
-            <w:r>
-              <w:rPr>
-                <w:rFonts w:ascii="Arial" w:cs="Arial" w:eastAsia="Arial" w:hAnsi="Arial"/>
-                <w:sz w:val="19"/>
-                <w:szCs w:val="19"/>
-              </w:rPr>
-              <w:t xml:space="preserve">Legal Translation and Localization</w:t>
-            </w:r>
-          </w:p>
-        </w:tc>
-        <w:tc>
-          <w:tcPr>
-            <w:tcW w:type="dxa" w:w="6160"/>
-            <w:tcMar>
-              <w:top w:type="dxa" w:w="70"/>
-              <w:left w:type="dxa" w:w="110"/>
-              <w:bottom w:type="dxa" w:w="70"/>
-              <w:right w:type="dxa" w:w="110"/>
-            </w:tcMar>
-            <w:vAlign w:val="top"/>
-          </w:tcPr>
-          <w:p>
-            <w:pPr>
-              <w:spacing w:after="40" w:line="252"/>
-              <w:jc w:val="left"/>
-            </w:pPr>
-            <w:r>
-              <w:rPr>
-                <w:rFonts w:ascii="Arial" w:cs="Arial" w:eastAsia="Arial" w:hAnsi="Arial"/>
-                <w:sz w:val="19"/>
-                <w:szCs w:val="19"/>
-              </w:rPr>
-              <w:t xml:space="preserve">Attorney-led translation and legal review of product and technology documents in the languages Netflix operates in</w:t>
+              <w:t xml:space="preserve">Global patent prosecution through Dentons' Intellectual Property practice, and local-law input in every market where Netflix operates, coordinated by Dentons KMN under one budget and one point of contact</w:t>
             </w:r>
           </w:p>
         </w:tc>
@@ -4044,7 +3920,7 @@
           <w:szCs w:val="21"/>
           <w:shd w:fill="FFF200" w:color="auto" w:val="clear"/>
         </w:rPr>
-        <w:t xml:space="preserve">[Insert current directory rankings (e.g. Chambers, Legal 500) for the privacy, IP/patents, TMT and consumer practices of Dentons KMN and the relevant Dentons offices, together with any ISO 27001 or equivalent information security certifications held by the firm.]</w:t>
+        <w:t xml:space="preserve">[Insert current directory rankings (e.g. Chambers, Legal 500, IFLR1000) for Dentons KMN and the relevant Dentons offices, together with any ISO 27001 or equivalent information security certifications held by the firm. In progress.]</w:t>
       </w:r>
     </w:p>
     <w:p>
@@ -4099,10 +3975,10 @@
         </w:tblBorders>
       </w:tblPr>
       <w:tblGrid>
-        <w:gridCol w:w="2100"/>
-        <w:gridCol w:w="2000"/>
-        <w:gridCol w:w="3860"/>
-        <w:gridCol w:w="1400"/>
+        <w:gridCol w:w="2400"/>
+        <w:gridCol w:w="1900"/>
+        <w:gridCol w:w="3760"/>
+        <w:gridCol w:w="1300"/>
       </w:tblGrid>
       <w:tr>
         <w:trPr>
@@ -4111,7 +3987,7 @@
         </w:trPr>
         <w:tc>
           <w:tcPr>
-            <w:tcW w:type="dxa" w:w="2100"/>
+            <w:tcW w:type="dxa" w:w="2400"/>
             <w:shd w:fill="5B2A86" w:color="auto" w:val="clear"/>
             <w:tcMar>
               <w:top w:type="dxa" w:w="70"/>
@@ -4141,7 +4017,7 @@
         </w:tc>
         <w:tc>
           <w:tcPr>
-            <w:tcW w:type="dxa" w:w="2000"/>
+            <w:tcW w:type="dxa" w:w="1900"/>
             <w:shd w:fill="5B2A86" w:color="auto" w:val="clear"/>
             <w:tcMar>
               <w:top w:type="dxa" w:w="70"/>
@@ -4171,7 +4047,7 @@
         </w:tc>
         <w:tc>
           <w:tcPr>
-            <w:tcW w:type="dxa" w:w="3860"/>
+            <w:tcW w:type="dxa" w:w="3760"/>
             <w:shd w:fill="5B2A86" w:color="auto" w:val="clear"/>
             <w:tcMar>
               <w:top w:type="dxa" w:w="70"/>
@@ -4201,7 +4077,7 @@
         </w:tc>
         <w:tc>
           <w:tcPr>
-            <w:tcW w:type="dxa" w:w="1400"/>
+            <w:tcW w:type="dxa" w:w="1300"/>
             <w:shd w:fill="5B2A86" w:color="auto" w:val="clear"/>
             <w:tcMar>
               <w:top w:type="dxa" w:w="70"/>
@@ -4237,7 +4113,7 @@
         </w:trPr>
         <w:tc>
           <w:tcPr>
-            <w:tcW w:type="dxa" w:w="2100"/>
+            <w:tcW w:type="dxa" w:w="2400"/>
             <w:tcMar>
               <w:top w:type="dxa" w:w="70"/>
               <w:left w:type="dxa" w:w="110"/>
@@ -4263,34 +4139,33 @@
         </w:tc>
         <w:tc>
           <w:tcPr>
-            <w:tcW w:type="dxa" w:w="2000"/>
-            <w:tcMar>
-              <w:top w:type="dxa" w:w="70"/>
-              <w:left w:type="dxa" w:w="110"/>
-              <w:bottom w:type="dxa" w:w="70"/>
-              <w:right w:type="dxa" w:w="110"/>
-            </w:tcMar>
-            <w:vAlign w:val="top"/>
-          </w:tcPr>
-          <w:p>
-            <w:pPr>
-              <w:spacing w:after="40" w:line="252"/>
-              <w:jc w:val="left"/>
-            </w:pPr>
-            <w:r>
-              <w:rPr>
-                <w:rFonts w:ascii="Arial" w:cs="Arial" w:eastAsia="Arial" w:hAnsi="Arial"/>
-                <w:sz w:val="18"/>
-                <w:szCs w:val="18"/>
-                <w:shd w:fill="FFF200" w:color="auto" w:val="clear"/>
-              </w:rPr>
-              <w:t xml:space="preserve">[Relationship Partner name]</w:t>
-            </w:r>
-          </w:p>
-        </w:tc>
-        <w:tc>
-          <w:tcPr>
-            <w:tcW w:type="dxa" w:w="3860"/>
+            <w:tcW w:type="dxa" w:w="1900"/>
+            <w:tcMar>
+              <w:top w:type="dxa" w:w="70"/>
+              <w:left w:type="dxa" w:w="110"/>
+              <w:bottom w:type="dxa" w:w="70"/>
+              <w:right w:type="dxa" w:w="110"/>
+            </w:tcMar>
+            <w:vAlign w:val="top"/>
+          </w:tcPr>
+          <w:p>
+            <w:pPr>
+              <w:spacing w:after="40" w:line="252"/>
+              <w:jc w:val="left"/>
+            </w:pPr>
+            <w:r>
+              <w:rPr>
+                <w:rFonts w:ascii="Arial" w:cs="Arial" w:eastAsia="Arial" w:hAnsi="Arial"/>
+                <w:sz w:val="18"/>
+                <w:szCs w:val="18"/>
+              </w:rPr>
+              <w:t xml:space="preserve">Agbor Nkongho</w:t>
+            </w:r>
+          </w:p>
+        </w:tc>
+        <w:tc>
+          <w:tcPr>
+            <w:tcW w:type="dxa" w:w="3760"/>
             <w:tcMar>
               <w:top w:type="dxa" w:w="70"/>
               <w:left w:type="dxa" w:w="110"/>
@@ -4316,28 +4191,27 @@
         </w:tc>
         <w:tc>
           <w:tcPr>
-            <w:tcW w:type="dxa" w:w="1400"/>
-            <w:tcMar>
-              <w:top w:type="dxa" w:w="70"/>
-              <w:left w:type="dxa" w:w="110"/>
-              <w:bottom w:type="dxa" w:w="70"/>
-              <w:right w:type="dxa" w:w="110"/>
-            </w:tcMar>
-            <w:vAlign w:val="top"/>
-          </w:tcPr>
-          <w:p>
-            <w:pPr>
-              <w:spacing w:after="40" w:line="252"/>
-              <w:jc w:val="left"/>
-            </w:pPr>
-            <w:r>
-              <w:rPr>
-                <w:rFonts w:ascii="Arial" w:cs="Arial" w:eastAsia="Arial" w:hAnsi="Arial"/>
-                <w:sz w:val="18"/>
-                <w:szCs w:val="18"/>
-                <w:shd w:fill="FFF200" w:color="auto" w:val="clear"/>
-              </w:rPr>
-              <w:t xml:space="preserve">[English, …]</w:t>
+            <w:tcW w:type="dxa" w:w="1300"/>
+            <w:tcMar>
+              <w:top w:type="dxa" w:w="70"/>
+              <w:left w:type="dxa" w:w="110"/>
+              <w:bottom w:type="dxa" w:w="70"/>
+              <w:right w:type="dxa" w:w="110"/>
+            </w:tcMar>
+            <w:vAlign w:val="top"/>
+          </w:tcPr>
+          <w:p>
+            <w:pPr>
+              <w:spacing w:after="40" w:line="252"/>
+              <w:jc w:val="left"/>
+            </w:pPr>
+            <w:r>
+              <w:rPr>
+                <w:rFonts w:ascii="Arial" w:cs="Arial" w:eastAsia="Arial" w:hAnsi="Arial"/>
+                <w:sz w:val="18"/>
+                <w:szCs w:val="18"/>
+              </w:rPr>
+              <w:t xml:space="preserve">English, French</w:t>
             </w:r>
           </w:p>
         </w:tc>
@@ -4349,7 +4223,7 @@
         </w:trPr>
         <w:tc>
           <w:tcPr>
-            <w:tcW w:type="dxa" w:w="2100"/>
+            <w:tcW w:type="dxa" w:w="2400"/>
             <w:shd w:fill="F2F2F2" w:color="auto" w:val="clear"/>
             <w:tcMar>
               <w:top w:type="dxa" w:w="70"/>
@@ -4370,13 +4244,13 @@
                 <w:sz w:val="18"/>
                 <w:szCs w:val="18"/>
               </w:rPr>
-              <w:t xml:space="preserve">Privacy &amp; Data Lead</w:t>
-            </w:r>
-          </w:p>
-        </w:tc>
-        <w:tc>
-          <w:tcPr>
-            <w:tcW w:type="dxa" w:w="2000"/>
+              <w:t xml:space="preserve">Compliance Lead – privacy, consumer protection and marketing compliance</w:t>
+            </w:r>
+          </w:p>
+        </w:tc>
+        <w:tc>
+          <w:tcPr>
+            <w:tcW w:type="dxa" w:w="1900"/>
             <w:shd w:fill="F2F2F2" w:color="auto" w:val="clear"/>
             <w:tcMar>
               <w:top w:type="dxa" w:w="70"/>
@@ -4398,13 +4272,13 @@
                 <w:szCs w:val="18"/>
                 <w:shd w:fill="FFF200" w:color="auto" w:val="clear"/>
               </w:rPr>
-              <w:t xml:space="preserve">[Privacy &amp; Data Lead name]</w:t>
-            </w:r>
-          </w:p>
-        </w:tc>
-        <w:tc>
-          <w:tcPr>
-            <w:tcW w:type="dxa" w:w="3860"/>
+              <w:t xml:space="preserve">[Compliance Lead name]</w:t>
+            </w:r>
+          </w:p>
+        </w:tc>
+        <w:tc>
+          <w:tcPr>
+            <w:tcW w:type="dxa" w:w="3760"/>
             <w:shd w:fill="F2F2F2" w:color="auto" w:val="clear"/>
             <w:tcMar>
               <w:top w:type="dxa" w:w="70"/>
@@ -4425,13 +4299,13 @@
                 <w:sz w:val="18"/>
                 <w:szCs w:val="18"/>
               </w:rPr>
-              <w:t xml:space="preserve">Product privacy counselling, DPIAs, transfers, regulator engagement, incident response</w:t>
-            </w:r>
-          </w:p>
-        </w:tc>
-        <w:tc>
-          <w:tcPr>
-            <w:tcW w:type="dxa" w:w="1400"/>
+              <w:t xml:space="preserve">Product privacy counselling, DPIAs, transfers, consumer and subscription rules, advertising and promotions, regulator engagement, incident response</w:t>
+            </w:r>
+          </w:p>
+        </w:tc>
+        <w:tc>
+          <w:tcPr>
+            <w:tcW w:type="dxa" w:w="1300"/>
             <w:shd w:fill="F2F2F2" w:color="auto" w:val="clear"/>
             <w:tcMar>
               <w:top w:type="dxa" w:w="70"/>
@@ -4451,9 +4325,8 @@
                 <w:rFonts w:ascii="Arial" w:cs="Arial" w:eastAsia="Arial" w:hAnsi="Arial"/>
                 <w:sz w:val="18"/>
                 <w:szCs w:val="18"/>
-                <w:shd w:fill="FFF200" w:color="auto" w:val="clear"/>
-              </w:rPr>
-              <w:t xml:space="preserve">[…]</w:t>
+              </w:rPr>
+              <w:t xml:space="preserve">English, French</w:t>
             </w:r>
           </w:p>
         </w:tc>
@@ -4465,33 +4338,33 @@
         </w:trPr>
         <w:tc>
           <w:tcPr>
-            <w:tcW w:type="dxa" w:w="2100"/>
-            <w:tcMar>
-              <w:top w:type="dxa" w:w="70"/>
-              <w:left w:type="dxa" w:w="110"/>
-              <w:bottom w:type="dxa" w:w="70"/>
-              <w:right w:type="dxa" w:w="110"/>
-            </w:tcMar>
-            <w:vAlign w:val="top"/>
-          </w:tcPr>
-          <w:p>
-            <w:pPr>
-              <w:spacing w:after="40" w:line="252"/>
-              <w:jc w:val="left"/>
-            </w:pPr>
-            <w:r>
-              <w:rPr>
-                <w:rFonts w:ascii="Arial" w:cs="Arial" w:eastAsia="Arial" w:hAnsi="Arial"/>
-                <w:sz w:val="18"/>
-                <w:szCs w:val="18"/>
-              </w:rPr>
-              <w:t xml:space="preserve">Consumer Protection &amp; Marketing Lead</w:t>
-            </w:r>
-          </w:p>
-        </w:tc>
-        <w:tc>
-          <w:tcPr>
-            <w:tcW w:type="dxa" w:w="2000"/>
+            <w:tcW w:type="dxa" w:w="2400"/>
+            <w:tcMar>
+              <w:top w:type="dxa" w:w="70"/>
+              <w:left w:type="dxa" w:w="110"/>
+              <w:bottom w:type="dxa" w:w="70"/>
+              <w:right w:type="dxa" w:w="110"/>
+            </w:tcMar>
+            <w:vAlign w:val="top"/>
+          </w:tcPr>
+          <w:p>
+            <w:pPr>
+              <w:spacing w:after="40" w:line="252"/>
+              <w:jc w:val="left"/>
+            </w:pPr>
+            <w:r>
+              <w:rPr>
+                <w:rFonts w:ascii="Arial" w:cs="Arial" w:eastAsia="Arial" w:hAnsi="Arial"/>
+                <w:sz w:val="18"/>
+                <w:szCs w:val="18"/>
+              </w:rPr>
+              <w:t xml:space="preserve">Legal Advisory Lead – product advisory and Translation &amp; Localization Desk</w:t>
+            </w:r>
+          </w:p>
+        </w:tc>
+        <w:tc>
+          <w:tcPr>
+            <w:tcW w:type="dxa" w:w="1900"/>
             <w:tcMar>
               <w:top w:type="dxa" w:w="70"/>
               <w:left w:type="dxa" w:w="110"/>
@@ -4512,60 +4385,59 @@
                 <w:szCs w:val="18"/>
                 <w:shd w:fill="FFF200" w:color="auto" w:val="clear"/>
               </w:rPr>
-              <w:t xml:space="preserve">[Consumer &amp; Marketing Lead name]</w:t>
-            </w:r>
-          </w:p>
-        </w:tc>
-        <w:tc>
-          <w:tcPr>
-            <w:tcW w:type="dxa" w:w="3860"/>
-            <w:tcMar>
-              <w:top w:type="dxa" w:w="70"/>
-              <w:left w:type="dxa" w:w="110"/>
-              <w:bottom w:type="dxa" w:w="70"/>
-              <w:right w:type="dxa" w:w="110"/>
-            </w:tcMar>
-            <w:vAlign w:val="top"/>
-          </w:tcPr>
-          <w:p>
-            <w:pPr>
-              <w:spacing w:after="40" w:line="252"/>
-              <w:jc w:val="left"/>
-            </w:pPr>
-            <w:r>
-              <w:rPr>
-                <w:rFonts w:ascii="Arial" w:cs="Arial" w:eastAsia="Arial" w:hAnsi="Arial"/>
-                <w:sz w:val="18"/>
-                <w:szCs w:val="18"/>
-              </w:rPr>
-              <w:t xml:space="preserve">Subscription and consumer rules, terms of use, advertising, promotions, ad-supported tier compliance</w:t>
-            </w:r>
-          </w:p>
-        </w:tc>
-        <w:tc>
-          <w:tcPr>
-            <w:tcW w:type="dxa" w:w="1400"/>
-            <w:tcMar>
-              <w:top w:type="dxa" w:w="70"/>
-              <w:left w:type="dxa" w:w="110"/>
-              <w:bottom w:type="dxa" w:w="70"/>
-              <w:right w:type="dxa" w:w="110"/>
-            </w:tcMar>
-            <w:vAlign w:val="top"/>
-          </w:tcPr>
-          <w:p>
-            <w:pPr>
-              <w:spacing w:after="40" w:line="252"/>
-              <w:jc w:val="left"/>
-            </w:pPr>
-            <w:r>
-              <w:rPr>
-                <w:rFonts w:ascii="Arial" w:cs="Arial" w:eastAsia="Arial" w:hAnsi="Arial"/>
-                <w:sz w:val="18"/>
-                <w:szCs w:val="18"/>
-                <w:shd w:fill="FFF200" w:color="auto" w:val="clear"/>
-              </w:rPr>
-              <w:t xml:space="preserve">[…]</w:t>
+              <w:t xml:space="preserve">[Legal Advisory Lead name]</w:t>
+            </w:r>
+          </w:p>
+        </w:tc>
+        <w:tc>
+          <w:tcPr>
+            <w:tcW w:type="dxa" w:w="3760"/>
+            <w:tcMar>
+              <w:top w:type="dxa" w:w="70"/>
+              <w:left w:type="dxa" w:w="110"/>
+              <w:bottom w:type="dxa" w:w="70"/>
+              <w:right w:type="dxa" w:w="110"/>
+            </w:tcMar>
+            <w:vAlign w:val="top"/>
+          </w:tcPr>
+          <w:p>
+            <w:pPr>
+              <w:spacing w:after="40" w:line="252"/>
+              <w:jc w:val="left"/>
+            </w:pPr>
+            <w:r>
+              <w:rPr>
+                <w:rFonts w:ascii="Arial" w:cs="Arial" w:eastAsia="Arial" w:hAnsi="Arial"/>
+                <w:sz w:val="18"/>
+                <w:szCs w:val="18"/>
+              </w:rPr>
+              <w:t xml:space="preserve">Day-to-day product and technology advice, terms of use and policies, attorney-translator pool, glossary governance, QA workflow, work in Netflix localization tools</w:t>
+            </w:r>
+          </w:p>
+        </w:tc>
+        <w:tc>
+          <w:tcPr>
+            <w:tcW w:type="dxa" w:w="1300"/>
+            <w:tcMar>
+              <w:top w:type="dxa" w:w="70"/>
+              <w:left w:type="dxa" w:w="110"/>
+              <w:bottom w:type="dxa" w:w="70"/>
+              <w:right w:type="dxa" w:w="110"/>
+            </w:tcMar>
+            <w:vAlign w:val="top"/>
+          </w:tcPr>
+          <w:p>
+            <w:pPr>
+              <w:spacing w:after="40" w:line="252"/>
+              <w:jc w:val="left"/>
+            </w:pPr>
+            <w:r>
+              <w:rPr>
+                <w:rFonts w:ascii="Arial" w:cs="Arial" w:eastAsia="Arial" w:hAnsi="Arial"/>
+                <w:sz w:val="18"/>
+                <w:szCs w:val="18"/>
+              </w:rPr>
+              <w:t xml:space="preserve">English, French</w:t>
             </w:r>
           </w:p>
         </w:tc>
@@ -4577,7 +4449,7 @@
         </w:trPr>
         <w:tc>
           <w:tcPr>
-            <w:tcW w:type="dxa" w:w="2100"/>
+            <w:tcW w:type="dxa" w:w="2400"/>
             <w:shd w:fill="F2F2F2" w:color="auto" w:val="clear"/>
             <w:tcMar>
               <w:top w:type="dxa" w:w="70"/>
@@ -4598,13 +4470,13 @@
                 <w:sz w:val="18"/>
                 <w:szCs w:val="18"/>
               </w:rPr>
-              <w:t xml:space="preserve">Patents &amp; IP Lead</w:t>
-            </w:r>
-          </w:p>
-        </w:tc>
-        <w:tc>
-          <w:tcPr>
-            <w:tcW w:type="dxa" w:w="2000"/>
+              <w:t xml:space="preserve">Corporate/M&amp;A Lead – product contracts and negotiations</w:t>
+            </w:r>
+          </w:p>
+        </w:tc>
+        <w:tc>
+          <w:tcPr>
+            <w:tcW w:type="dxa" w:w="1900"/>
             <w:shd w:fill="F2F2F2" w:color="auto" w:val="clear"/>
             <w:tcMar>
               <w:top w:type="dxa" w:w="70"/>
@@ -4626,13 +4498,13 @@
                 <w:szCs w:val="18"/>
                 <w:shd w:fill="FFF200" w:color="auto" w:val="clear"/>
               </w:rPr>
-              <w:t xml:space="preserve">[Patents &amp; IP Lead name]</w:t>
-            </w:r>
-          </w:p>
-        </w:tc>
-        <w:tc>
-          <w:tcPr>
-            <w:tcW w:type="dxa" w:w="3860"/>
+              <w:t xml:space="preserve">[Corporate/M&amp;A Lead name]</w:t>
+            </w:r>
+          </w:p>
+        </w:tc>
+        <w:tc>
+          <w:tcPr>
+            <w:tcW w:type="dxa" w:w="3760"/>
             <w:shd w:fill="F2F2F2" w:color="auto" w:val="clear"/>
             <w:tcMar>
               <w:top w:type="dxa" w:w="70"/>
@@ -4653,13 +4525,13 @@
                 <w:sz w:val="18"/>
                 <w:szCs w:val="18"/>
               </w:rPr>
-              <w:t xml:space="preserve">Patent drafting and prosecution strategy, portfolio management, foreign associate network coordination</w:t>
-            </w:r>
-          </w:p>
-        </w:tc>
-        <w:tc>
-          <w:tcPr>
-            <w:tcW w:type="dxa" w:w="1400"/>
+              <w:t xml:space="preserve">Product, platform, device, licensing and procurement contracts; playbooks; time-sensitive negotiations</w:t>
+            </w:r>
+          </w:p>
+        </w:tc>
+        <w:tc>
+          <w:tcPr>
+            <w:tcW w:type="dxa" w:w="1300"/>
             <w:shd w:fill="F2F2F2" w:color="auto" w:val="clear"/>
             <w:tcMar>
               <w:top w:type="dxa" w:w="70"/>
@@ -4679,9 +4551,8 @@
                 <w:rFonts w:ascii="Arial" w:cs="Arial" w:eastAsia="Arial" w:hAnsi="Arial"/>
                 <w:sz w:val="18"/>
                 <w:szCs w:val="18"/>
-                <w:shd w:fill="FFF200" w:color="auto" w:val="clear"/>
-              </w:rPr>
-              <w:t xml:space="preserve">[…]</w:t>
+              </w:rPr>
+              <w:t xml:space="preserve">English, French</w:t>
             </w:r>
           </w:p>
         </w:tc>
@@ -4693,33 +4564,33 @@
         </w:trPr>
         <w:tc>
           <w:tcPr>
-            <w:tcW w:type="dxa" w:w="2100"/>
-            <w:tcMar>
-              <w:top w:type="dxa" w:w="70"/>
-              <w:left w:type="dxa" w:w="110"/>
-              <w:bottom w:type="dxa" w:w="70"/>
-              <w:right w:type="dxa" w:w="110"/>
-            </w:tcMar>
-            <w:vAlign w:val="top"/>
-          </w:tcPr>
-          <w:p>
-            <w:pPr>
-              <w:spacing w:after="40" w:line="252"/>
-              <w:jc w:val="left"/>
-            </w:pPr>
-            <w:r>
-              <w:rPr>
-                <w:rFonts w:ascii="Arial" w:cs="Arial" w:eastAsia="Arial" w:hAnsi="Arial"/>
-                <w:sz w:val="18"/>
-                <w:szCs w:val="18"/>
-              </w:rPr>
-              <w:t xml:space="preserve">Product Contracts &amp; Commercial Lead</w:t>
-            </w:r>
-          </w:p>
-        </w:tc>
-        <w:tc>
-          <w:tcPr>
-            <w:tcW w:type="dxa" w:w="2000"/>
+            <w:tcW w:type="dxa" w:w="2400"/>
+            <w:tcMar>
+              <w:top w:type="dxa" w:w="70"/>
+              <w:left w:type="dxa" w:w="110"/>
+              <w:bottom w:type="dxa" w:w="70"/>
+              <w:right w:type="dxa" w:w="110"/>
+            </w:tcMar>
+            <w:vAlign w:val="top"/>
+          </w:tcPr>
+          <w:p>
+            <w:pPr>
+              <w:spacing w:after="40" w:line="252"/>
+              <w:jc w:val="left"/>
+            </w:pPr>
+            <w:r>
+              <w:rPr>
+                <w:rFonts w:ascii="Arial" w:cs="Arial" w:eastAsia="Arial" w:hAnsi="Arial"/>
+                <w:sz w:val="18"/>
+                <w:szCs w:val="18"/>
+              </w:rPr>
+              <w:t xml:space="preserve">Energy &amp; PPP Lead – regulatory inquiries</w:t>
+            </w:r>
+          </w:p>
+        </w:tc>
+        <w:tc>
+          <w:tcPr>
+            <w:tcW w:type="dxa" w:w="1900"/>
             <w:tcMar>
               <w:top w:type="dxa" w:w="70"/>
               <w:left w:type="dxa" w:w="110"/>
@@ -4740,60 +4611,59 @@
                 <w:szCs w:val="18"/>
                 <w:shd w:fill="FFF200" w:color="auto" w:val="clear"/>
               </w:rPr>
-              <w:t xml:space="preserve">[Product Contracts Lead name]</w:t>
-            </w:r>
-          </w:p>
-        </w:tc>
-        <w:tc>
-          <w:tcPr>
-            <w:tcW w:type="dxa" w:w="3860"/>
-            <w:tcMar>
-              <w:top w:type="dxa" w:w="70"/>
-              <w:left w:type="dxa" w:w="110"/>
-              <w:bottom w:type="dxa" w:w="70"/>
-              <w:right w:type="dxa" w:w="110"/>
-            </w:tcMar>
-            <w:vAlign w:val="top"/>
-          </w:tcPr>
-          <w:p>
-            <w:pPr>
-              <w:spacing w:after="40" w:line="252"/>
-              <w:jc w:val="left"/>
-            </w:pPr>
-            <w:r>
-              <w:rPr>
-                <w:rFonts w:ascii="Arial" w:cs="Arial" w:eastAsia="Arial" w:hAnsi="Arial"/>
-                <w:sz w:val="18"/>
-                <w:szCs w:val="18"/>
-              </w:rPr>
-              <w:t xml:space="preserve">Product, platform, device, licensing and procurement contracts; playbooks; time-sensitive negotiations</w:t>
-            </w:r>
-          </w:p>
-        </w:tc>
-        <w:tc>
-          <w:tcPr>
-            <w:tcW w:type="dxa" w:w="1400"/>
-            <w:tcMar>
-              <w:top w:type="dxa" w:w="70"/>
-              <w:left w:type="dxa" w:w="110"/>
-              <w:bottom w:type="dxa" w:w="70"/>
-              <w:right w:type="dxa" w:w="110"/>
-            </w:tcMar>
-            <w:vAlign w:val="top"/>
-          </w:tcPr>
-          <w:p>
-            <w:pPr>
-              <w:spacing w:after="40" w:line="252"/>
-              <w:jc w:val="left"/>
-            </w:pPr>
-            <w:r>
-              <w:rPr>
-                <w:rFonts w:ascii="Arial" w:cs="Arial" w:eastAsia="Arial" w:hAnsi="Arial"/>
-                <w:sz w:val="18"/>
-                <w:szCs w:val="18"/>
-                <w:shd w:fill="FFF200" w:color="auto" w:val="clear"/>
-              </w:rPr>
-              <w:t xml:space="preserve">[…]</w:t>
+              <w:t xml:space="preserve">[Energy &amp; PPP Lead name]</w:t>
+            </w:r>
+          </w:p>
+        </w:tc>
+        <w:tc>
+          <w:tcPr>
+            <w:tcW w:type="dxa" w:w="3760"/>
+            <w:tcMar>
+              <w:top w:type="dxa" w:w="70"/>
+              <w:left w:type="dxa" w:w="110"/>
+              <w:bottom w:type="dxa" w:w="70"/>
+              <w:right w:type="dxa" w:w="110"/>
+            </w:tcMar>
+            <w:vAlign w:val="top"/>
+          </w:tcPr>
+          <w:p>
+            <w:pPr>
+              <w:spacing w:after="40" w:line="252"/>
+              <w:jc w:val="left"/>
+            </w:pPr>
+            <w:r>
+              <w:rPr>
+                <w:rFonts w:ascii="Arial" w:cs="Arial" w:eastAsia="Arial" w:hAnsi="Arial"/>
+                <w:sz w:val="18"/>
+                <w:szCs w:val="18"/>
+              </w:rPr>
+              <w:t xml:space="preserve">Coordinated responses to regulators and public authorities, consultations, government engagement</w:t>
+            </w:r>
+          </w:p>
+        </w:tc>
+        <w:tc>
+          <w:tcPr>
+            <w:tcW w:type="dxa" w:w="1300"/>
+            <w:tcMar>
+              <w:top w:type="dxa" w:w="70"/>
+              <w:left w:type="dxa" w:w="110"/>
+              <w:bottom w:type="dxa" w:w="70"/>
+              <w:right w:type="dxa" w:w="110"/>
+            </w:tcMar>
+            <w:vAlign w:val="top"/>
+          </w:tcPr>
+          <w:p>
+            <w:pPr>
+              <w:spacing w:after="40" w:line="252"/>
+              <w:jc w:val="left"/>
+            </w:pPr>
+            <w:r>
+              <w:rPr>
+                <w:rFonts w:ascii="Arial" w:cs="Arial" w:eastAsia="Arial" w:hAnsi="Arial"/>
+                <w:sz w:val="18"/>
+                <w:szCs w:val="18"/>
+              </w:rPr>
+              <w:t xml:space="preserve">English, French</w:t>
             </w:r>
           </w:p>
         </w:tc>
@@ -4805,7 +4675,7 @@
         </w:trPr>
         <w:tc>
           <w:tcPr>
-            <w:tcW w:type="dxa" w:w="2100"/>
+            <w:tcW w:type="dxa" w:w="2400"/>
             <w:shd w:fill="F2F2F2" w:color="auto" w:val="clear"/>
             <w:tcMar>
               <w:top w:type="dxa" w:w="70"/>
@@ -4826,13 +4696,13 @@
                 <w:sz w:val="18"/>
                 <w:szCs w:val="18"/>
               </w:rPr>
-              <w:t xml:space="preserve">Translation &amp; Localization Desk Lead</w:t>
-            </w:r>
-          </w:p>
-        </w:tc>
-        <w:tc>
-          <w:tcPr>
-            <w:tcW w:type="dxa" w:w="2000"/>
+              <w:t xml:space="preserve">Banking &amp; Finance Lead – payments and subscription billing</w:t>
+            </w:r>
+          </w:p>
+        </w:tc>
+        <w:tc>
+          <w:tcPr>
+            <w:tcW w:type="dxa" w:w="1900"/>
             <w:shd w:fill="F2F2F2" w:color="auto" w:val="clear"/>
             <w:tcMar>
               <w:top w:type="dxa" w:w="70"/>
@@ -4854,13 +4724,13 @@
                 <w:szCs w:val="18"/>
                 <w:shd w:fill="FFF200" w:color="auto" w:val="clear"/>
               </w:rPr>
-              <w:t xml:space="preserve">[Translation Desk Lead name]</w:t>
-            </w:r>
-          </w:p>
-        </w:tc>
-        <w:tc>
-          <w:tcPr>
-            <w:tcW w:type="dxa" w:w="3860"/>
+              <w:t xml:space="preserve">[Banking &amp; Finance Lead name]</w:t>
+            </w:r>
+          </w:p>
+        </w:tc>
+        <w:tc>
+          <w:tcPr>
+            <w:tcW w:type="dxa" w:w="3760"/>
             <w:shd w:fill="F2F2F2" w:color="auto" w:val="clear"/>
             <w:tcMar>
               <w:top w:type="dxa" w:w="70"/>
@@ -4881,13 +4751,13 @@
                 <w:sz w:val="18"/>
                 <w:szCs w:val="18"/>
               </w:rPr>
-              <w:t xml:space="preserve">Attorney-translator pool, glossary governance, QA workflow, work in Netflix localization tools, turnaround management</w:t>
-            </w:r>
-          </w:p>
-        </w:tc>
-        <w:tc>
-          <w:tcPr>
-            <w:tcW w:type="dxa" w:w="1400"/>
+              <w:t xml:space="preserve">Payments, billing and consumer-credit aspects of product flows, fintech partnerships, financial-regulatory questions</w:t>
+            </w:r>
+          </w:p>
+        </w:tc>
+        <w:tc>
+          <w:tcPr>
+            <w:tcW w:type="dxa" w:w="1300"/>
             <w:shd w:fill="F2F2F2" w:color="auto" w:val="clear"/>
             <w:tcMar>
               <w:top w:type="dxa" w:w="70"/>
@@ -4907,9 +4777,8 @@
                 <w:rFonts w:ascii="Arial" w:cs="Arial" w:eastAsia="Arial" w:hAnsi="Arial"/>
                 <w:sz w:val="18"/>
                 <w:szCs w:val="18"/>
-                <w:shd w:fill="FFF200" w:color="auto" w:val="clear"/>
-              </w:rPr>
-              <w:t xml:space="preserve">[…]</w:t>
+              </w:rPr>
+              <w:t xml:space="preserve">English, French</w:t>
             </w:r>
           </w:p>
         </w:tc>
@@ -4921,33 +4790,33 @@
         </w:trPr>
         <w:tc>
           <w:tcPr>
-            <w:tcW w:type="dxa" w:w="2100"/>
-            <w:tcMar>
-              <w:top w:type="dxa" w:w="70"/>
-              <w:left w:type="dxa" w:w="110"/>
-              <w:bottom w:type="dxa" w:w="70"/>
-              <w:right w:type="dxa" w:w="110"/>
-            </w:tcMar>
-            <w:vAlign w:val="top"/>
-          </w:tcPr>
-          <w:p>
-            <w:pPr>
-              <w:spacing w:after="40" w:line="252"/>
-              <w:jc w:val="left"/>
-            </w:pPr>
-            <w:r>
-              <w:rPr>
-                <w:rFonts w:ascii="Arial" w:cs="Arial" w:eastAsia="Arial" w:hAnsi="Arial"/>
-                <w:sz w:val="18"/>
-                <w:szCs w:val="18"/>
-              </w:rPr>
-              <w:t xml:space="preserve">Client Service &amp; Billing Manager</w:t>
-            </w:r>
-          </w:p>
-        </w:tc>
-        <w:tc>
-          <w:tcPr>
-            <w:tcW w:type="dxa" w:w="2000"/>
+            <w:tcW w:type="dxa" w:w="2400"/>
+            <w:tcMar>
+              <w:top w:type="dxa" w:w="70"/>
+              <w:left w:type="dxa" w:w="110"/>
+              <w:bottom w:type="dxa" w:w="70"/>
+              <w:right w:type="dxa" w:w="110"/>
+            </w:tcMar>
+            <w:vAlign w:val="top"/>
+          </w:tcPr>
+          <w:p>
+            <w:pPr>
+              <w:spacing w:after="40" w:line="252"/>
+              <w:jc w:val="left"/>
+            </w:pPr>
+            <w:r>
+              <w:rPr>
+                <w:rFonts w:ascii="Arial" w:cs="Arial" w:eastAsia="Arial" w:hAnsi="Arial"/>
+                <w:sz w:val="18"/>
+                <w:szCs w:val="18"/>
+              </w:rPr>
+              <w:t xml:space="preserve">Dentons global IP &amp; Patents Lead – global patent prosecution</w:t>
+            </w:r>
+          </w:p>
+        </w:tc>
+        <w:tc>
+          <w:tcPr>
+            <w:tcW w:type="dxa" w:w="1900"/>
             <w:tcMar>
               <w:top w:type="dxa" w:w="70"/>
               <w:left w:type="dxa" w:w="110"/>
@@ -4968,39 +4837,39 @@
                 <w:szCs w:val="18"/>
                 <w:shd w:fill="FFF200" w:color="auto" w:val="clear"/>
               </w:rPr>
-              <w:t xml:space="preserve">[Client Service / Billing Manager name]</w:t>
-            </w:r>
-          </w:p>
-        </w:tc>
-        <w:tc>
-          <w:tcPr>
-            <w:tcW w:type="dxa" w:w="3860"/>
-            <w:tcMar>
-              <w:top w:type="dxa" w:w="70"/>
-              <w:left w:type="dxa" w:w="110"/>
-              <w:bottom w:type="dxa" w:w="70"/>
-              <w:right w:type="dxa" w:w="110"/>
-            </w:tcMar>
-            <w:vAlign w:val="top"/>
-          </w:tcPr>
-          <w:p>
-            <w:pPr>
-              <w:spacing w:after="40" w:line="252"/>
-              <w:jc w:val="left"/>
-            </w:pPr>
-            <w:r>
-              <w:rPr>
-                <w:rFonts w:ascii="Arial" w:cs="Arial" w:eastAsia="Arial" w:hAnsi="Arial"/>
-                <w:sz w:val="18"/>
-                <w:szCs w:val="18"/>
-              </w:rPr>
-              <w:t xml:space="preserve">Legal Tracker administration, LEDES invoicing, accruals, rate submissions, rejection handling, dashboard reporting</w:t>
-            </w:r>
-          </w:p>
-        </w:tc>
-        <w:tc>
-          <w:tcPr>
-            <w:tcW w:type="dxa" w:w="1400"/>
+              <w:t xml:space="preserve">[Dentons global IP &amp; Patents Lead name and office]</w:t>
+            </w:r>
+          </w:p>
+        </w:tc>
+        <w:tc>
+          <w:tcPr>
+            <w:tcW w:type="dxa" w:w="3760"/>
+            <w:tcMar>
+              <w:top w:type="dxa" w:w="70"/>
+              <w:left w:type="dxa" w:w="110"/>
+              <w:bottom w:type="dxa" w:w="70"/>
+              <w:right w:type="dxa" w:w="110"/>
+            </w:tcMar>
+            <w:vAlign w:val="top"/>
+          </w:tcPr>
+          <w:p>
+            <w:pPr>
+              <w:spacing w:after="40" w:line="252"/>
+              <w:jc w:val="left"/>
+            </w:pPr>
+            <w:r>
+              <w:rPr>
+                <w:rFonts w:ascii="Arial" w:cs="Arial" w:eastAsia="Arial" w:hAnsi="Arial"/>
+                <w:sz w:val="18"/>
+                <w:szCs w:val="18"/>
+              </w:rPr>
+              <w:t xml:space="preserve">Patent drafting and prosecution strategy, portfolio management, foreign associate coordination, delivered through Dentons' global IP practice and coordinated by Dentons KMN</w:t>
+            </w:r>
+          </w:p>
+        </w:tc>
+        <w:tc>
+          <w:tcPr>
+            <w:tcW w:type="dxa" w:w="1300"/>
             <w:tcMar>
               <w:top w:type="dxa" w:w="70"/>
               <w:left w:type="dxa" w:w="110"/>
@@ -5032,7 +4901,7 @@
         </w:trPr>
         <w:tc>
           <w:tcPr>
-            <w:tcW w:type="dxa" w:w="2100"/>
+            <w:tcW w:type="dxa" w:w="2400"/>
             <w:shd w:fill="F2F2F2" w:color="auto" w:val="clear"/>
             <w:tcMar>
               <w:top w:type="dxa" w:w="70"/>
@@ -5053,14 +4922,126 @@
                 <w:sz w:val="18"/>
                 <w:szCs w:val="18"/>
               </w:rPr>
+              <w:t xml:space="preserve">Client Service &amp; Billing Manager</w:t>
+            </w:r>
+          </w:p>
+        </w:tc>
+        <w:tc>
+          <w:tcPr>
+            <w:tcW w:type="dxa" w:w="1900"/>
+            <w:shd w:fill="F2F2F2" w:color="auto" w:val="clear"/>
+            <w:tcMar>
+              <w:top w:type="dxa" w:w="70"/>
+              <w:left w:type="dxa" w:w="110"/>
+              <w:bottom w:type="dxa" w:w="70"/>
+              <w:right w:type="dxa" w:w="110"/>
+            </w:tcMar>
+            <w:vAlign w:val="top"/>
+          </w:tcPr>
+          <w:p>
+            <w:pPr>
+              <w:spacing w:after="40" w:line="252"/>
+              <w:jc w:val="left"/>
+            </w:pPr>
+            <w:r>
+              <w:rPr>
+                <w:rFonts w:ascii="Arial" w:cs="Arial" w:eastAsia="Arial" w:hAnsi="Arial"/>
+                <w:sz w:val="18"/>
+                <w:szCs w:val="18"/>
+              </w:rPr>
+              <w:t xml:space="preserve">Christian Ekwe</w:t>
+            </w:r>
+          </w:p>
+        </w:tc>
+        <w:tc>
+          <w:tcPr>
+            <w:tcW w:type="dxa" w:w="3760"/>
+            <w:shd w:fill="F2F2F2" w:color="auto" w:val="clear"/>
+            <w:tcMar>
+              <w:top w:type="dxa" w:w="70"/>
+              <w:left w:type="dxa" w:w="110"/>
+              <w:bottom w:type="dxa" w:w="70"/>
+              <w:right w:type="dxa" w:w="110"/>
+            </w:tcMar>
+            <w:vAlign w:val="top"/>
+          </w:tcPr>
+          <w:p>
+            <w:pPr>
+              <w:spacing w:after="40" w:line="252"/>
+              <w:jc w:val="left"/>
+            </w:pPr>
+            <w:r>
+              <w:rPr>
+                <w:rFonts w:ascii="Arial" w:cs="Arial" w:eastAsia="Arial" w:hAnsi="Arial"/>
+                <w:sz w:val="18"/>
+                <w:szCs w:val="18"/>
+              </w:rPr>
+              <w:t xml:space="preserve">Legal Tracker administration, LEDES invoicing, accruals, rate submissions, rejection handling, dashboard reporting</w:t>
+            </w:r>
+          </w:p>
+        </w:tc>
+        <w:tc>
+          <w:tcPr>
+            <w:tcW w:type="dxa" w:w="1300"/>
+            <w:shd w:fill="F2F2F2" w:color="auto" w:val="clear"/>
+            <w:tcMar>
+              <w:top w:type="dxa" w:w="70"/>
+              <w:left w:type="dxa" w:w="110"/>
+              <w:bottom w:type="dxa" w:w="70"/>
+              <w:right w:type="dxa" w:w="110"/>
+            </w:tcMar>
+            <w:vAlign w:val="top"/>
+          </w:tcPr>
+          <w:p>
+            <w:pPr>
+              <w:spacing w:after="40" w:line="252"/>
+              <w:jc w:val="left"/>
+            </w:pPr>
+            <w:r>
+              <w:rPr>
+                <w:rFonts w:ascii="Arial" w:cs="Arial" w:eastAsia="Arial" w:hAnsi="Arial"/>
+                <w:sz w:val="18"/>
+                <w:szCs w:val="18"/>
+              </w:rPr>
+              <w:t xml:space="preserve">English, French</w:t>
+            </w:r>
+          </w:p>
+        </w:tc>
+      </w:tr>
+      <w:tr>
+        <w:trPr>
+          <w:cantSplit/>
+          <w:tblHeader w:val="false"/>
+        </w:trPr>
+        <w:tc>
+          <w:tcPr>
+            <w:tcW w:type="dxa" w:w="2400"/>
+            <w:tcMar>
+              <w:top w:type="dxa" w:w="70"/>
+              <w:left w:type="dxa" w:w="110"/>
+              <w:bottom w:type="dxa" w:w="70"/>
+              <w:right w:type="dxa" w:w="110"/>
+            </w:tcMar>
+            <w:vAlign w:val="top"/>
+          </w:tcPr>
+          <w:p>
+            <w:pPr>
+              <w:spacing w:after="40" w:line="252"/>
+              <w:jc w:val="left"/>
+            </w:pPr>
+            <w:r>
+              <w:rPr>
+                <w:rFonts w:ascii="Arial" w:cs="Arial" w:eastAsia="Arial" w:hAnsi="Arial"/>
+                <w:sz w:val="18"/>
+                <w:szCs w:val="18"/>
+              </w:rPr>
               <w:t xml:space="preserve">Security Point of Contact</w:t>
             </w:r>
           </w:p>
         </w:tc>
         <w:tc>
           <w:tcPr>
-            <w:tcW w:type="dxa" w:w="2000"/>
-            <w:shd w:fill="F2F2F2" w:color="auto" w:val="clear"/>
+            <w:tcW w:type="dxa" w:w="1900"/>
             <w:tcMar>
               <w:top w:type="dxa" w:w="70"/>
               <w:left w:type="dxa" w:w="110"/>
@@ -5081,14 +5062,13 @@
                 <w:szCs w:val="18"/>
                 <w:shd w:fill="FFF200" w:color="auto" w:val="clear"/>
               </w:rPr>
-              <w:t xml:space="preserve">[Chief Information Security Officer name]</w:t>
-            </w:r>
-          </w:p>
-        </w:tc>
-        <w:tc>
-          <w:tcPr>
-            <w:tcW w:type="dxa" w:w="3860"/>
-            <w:shd w:fill="F2F2F2" w:color="auto" w:val="clear"/>
+              <w:t xml:space="preserve">[Security Point of Contact name]</w:t>
+            </w:r>
+          </w:p>
+        </w:tc>
+        <w:tc>
+          <w:tcPr>
+            <w:tcW w:type="dxa" w:w="3760"/>
             <w:tcMar>
               <w:top w:type="dxa" w:w="70"/>
               <w:left w:type="dxa" w:w="110"/>
@@ -5114,28 +5094,27 @@
         </w:tc>
         <w:tc>
           <w:tcPr>
-            <w:tcW w:type="dxa" w:w="1400"/>
-            <w:shd w:fill="F2F2F2" w:color="auto" w:val="clear"/>
-            <w:tcMar>
-              <w:top w:type="dxa" w:w="70"/>
-              <w:left w:type="dxa" w:w="110"/>
-              <w:bottom w:type="dxa" w:w="70"/>
-              <w:right w:type="dxa" w:w="110"/>
-            </w:tcMar>
-            <w:vAlign w:val="top"/>
-          </w:tcPr>
-          <w:p>
-            <w:pPr>
-              <w:spacing w:after="40" w:line="252"/>
-              <w:jc w:val="left"/>
-            </w:pPr>
-            <w:r>
-              <w:rPr>
-                <w:rFonts w:ascii="Arial" w:cs="Arial" w:eastAsia="Arial" w:hAnsi="Arial"/>
-                <w:sz w:val="18"/>
-                <w:szCs w:val="18"/>
-              </w:rPr>
-              <w:t xml:space="preserve">English</w:t>
+            <w:tcW w:type="dxa" w:w="1300"/>
+            <w:tcMar>
+              <w:top w:type="dxa" w:w="70"/>
+              <w:left w:type="dxa" w:w="110"/>
+              <w:bottom w:type="dxa" w:w="70"/>
+              <w:right w:type="dxa" w:w="110"/>
+            </w:tcMar>
+            <w:vAlign w:val="top"/>
+          </w:tcPr>
+          <w:p>
+            <w:pPr>
+              <w:spacing w:after="40" w:line="252"/>
+              <w:jc w:val="left"/>
+            </w:pPr>
+            <w:r>
+              <w:rPr>
+                <w:rFonts w:ascii="Arial" w:cs="Arial" w:eastAsia="Arial" w:hAnsi="Arial"/>
+                <w:sz w:val="18"/>
+                <w:szCs w:val="18"/>
+              </w:rPr>
+              <w:t xml:space="preserve">English, French</w:t>
             </w:r>
           </w:p>
         </w:tc>
@@ -5335,7 +5314,7 @@
           <w:sz w:val="21"/>
           <w:szCs w:val="21"/>
         </w:rPr>
-        <w:t xml:space="preserve"> Local-law input from other Dentons offices is coordinated by the core team and is scoped, budgeted and approved in advance; it is billed on the same Netflix terms.</w:t>
+        <w:t xml:space="preserve"> Patent prosecution and local-law input from other Dentons offices are coordinated by the core team and are scoped, budgeted and approved in advance, so that Netflix has one point of contact, one budget and one docket.</w:t>
       </w:r>
     </w:p>
     <w:p>
@@ -5751,7 +5730,7 @@
           <w:sz w:val="21"/>
           <w:szCs w:val="21"/>
         </w:rPr>
-        <w:t xml:space="preserve"> A single prosecution lead maintains Netflix's docket in our IP management system with automated deadline control and a monthly portfolio report. Foreign associate fees are engaged only with prior approval, paid by us and passed through at cost with the associate's invoice attached, as the Guidelines require. Where Netflix prefers, we work on a fixed-fee-per-stage basis (drafting, filing, office action response, grant) so prosecution spend is fully predictable.</w:t>
+        <w:t xml:space="preserve"> Patent drafting and prosecution is delivered through Dentons' global Intellectual Property practice and coordinated for Netflix by Dentons KMN, so that Netflix has one point of contact, one budget and one docket. A single prosecution lead maintains Netflix's docket with automated deadline control and a monthly portfolio report. Foreign associate fees are engaged only with prior approval, paid by us and passed through at cost with the associate's invoice attached, as the Guidelines require. Where Netflix prefers, each stage (drafting, filing, office action response, grant) is quoted as a fixed fee based on its scope so prosecution spend is fully predictable.</w:t>
       </w:r>
     </w:p>
     <w:p>
@@ -6065,7 +6044,7 @@
           <w:sz w:val="21"/>
           <w:szCs w:val="21"/>
         </w:rPr>
-        <w:t xml:space="preserve">Netflix has set specific expectations for translation work, and we have designed a dedicated desk around them.</w:t>
+        <w:t xml:space="preserve">Netflix has set specific expectations for translation work, and we have designed a dedicated desk around them. Dentons KMN practises in a bilingual jurisdiction: our lawyers draft, negotiate and advise in both English and French every day, which gives Netflix a translation desk whose members are practising attorneys in both languages rather than translators with legal training. Other languages are covered by attorney-translators in Dentons offices across the network, working under the same workflow and QA rules.</w:t>
       </w:r>
     </w:p>
     <w:tbl>
@@ -6203,7 +6182,7 @@
                 <w:sz w:val="19"/>
                 <w:szCs w:val="19"/>
               </w:rPr>
-              <w:t xml:space="preserve">Translation is performed and reviewed only by qualified lawyers who are native or near-native speakers of the target language and trained in the relevant legal system</w:t>
+              <w:t xml:space="preserve">Translation is performed and reviewed only by qualified lawyers who are native or near-native speakers of the target language and trained in the relevant legal system; English–French is handled in Douala, other languages through Dentons offices in the network</w:t>
             </w:r>
           </w:p>
         </w:tc>
@@ -6499,7 +6478,7 @@
                 <w:sz w:val="19"/>
                 <w:szCs w:val="19"/>
               </w:rPr>
-              <w:t xml:space="preserve">Fixed fees per 1,000 source words by language tier, standard turnaround of 2 business days for documents up to 3,000 words, and a rush option</w:t>
+              <w:t xml:space="preserve">A fixed fee quoted per translation batch based on its scope (word count, document type, languages), agreed before work starts; standard turnaround of 2 business days for documents up to 3,000 words, and a rush option</w:t>
             </w:r>
           </w:p>
         </w:tc>
@@ -8281,7 +8260,7 @@
           <w:szCs w:val="21"/>
           <w:shd w:fill="FFF200" w:color="auto" w:val="clear"/>
         </w:rPr>
-        <w:t xml:space="preserve">[Insert current composition statistics for the proposed team, e.g. percentage of women and of lawyers from under-represented backgrounds among partners and among the team overall.]</w:t>
+        <w:t xml:space="preserve">[Insert current composition statistics for the proposed team, e.g. percentage of women and of lawyers from under-represented backgrounds among partners and among the team overall. In progress.]</w:t>
       </w:r>
     </w:p>
     <w:p>
@@ -8374,7 +8353,7 @@
           <w:szCs w:val="21"/>
           <w:shd w:fill="FFF200" w:color="auto" w:val="clear"/>
         </w:rPr>
-        <w:t xml:space="preserve">[Insert Dentons KMN and Dentons diversity and inclusion policies, targets, affinity networks, mentoring and sponsorship programmes, and any external commitments or certifications.]</w:t>
+        <w:t xml:space="preserve">[Insert Dentons KMN and Dentons diversity and inclusion policies, targets, affinity networks, mentoring and sponsorship programmes, and any external commitments or certifications. In progress.]</w:t>
       </w:r>
     </w:p>
     <w:p>
@@ -8431,7 +8410,7 @@
           <w:sz w:val="21"/>
           <w:szCs w:val="21"/>
         </w:rPr>
-        <w:t xml:space="preserve">Netflix is looking for transparent, predictable and competitive fee models that align with a long-term partnership and performance-based goals. Our proposal combines a discounted, frozen rate card with a menu of alternative fee arrangements that Netflix can apply matter by matter. Full detail, including the calculators, is in the "Rate Card" and "Fee Model" tabs of the RFP spreadsheet.</w:t>
+        <w:t xml:space="preserve">Netflix is looking for transparent, predictable and competitive fee models that align with a long-term partnership and performance-based goals. Dentons KMN does not operate a tiered rate card. Our proposal combines a single hourly rate for all lawyer time, subscription bands for day-to-day advisory work, and fixed fees quoted per scope of work, with volume credits and a portion of our fees at risk against performance. Full detail, including the calculators, is in the "Hourly Rate" and "Fee Model" tabs of the RFP spreadsheet.</w:t>
       </w:r>
     </w:p>
     <w:tbl>
@@ -8489,7 +8468,7 @@
                 <w:sz w:val="20"/>
                 <w:szCs w:val="20"/>
               </w:rPr>
-              <w:t xml:space="preserve">Predictable.</w:t>
+              <w:t xml:space="preserve">Simple.</w:t>
             </w:r>
             <w:r>
               <w:rPr>
@@ -8497,7 +8476,7 @@
                 <w:sz w:val="20"/>
                 <w:szCs w:val="20"/>
               </w:rPr>
-              <w:t xml:space="preserve"> Rates fixed for three years from 1 January 2027, with no step or promotion increases for partners, principals or of counsel, and any later adjustment discussed with the Netflix Matter Lead within Netflix's annual rate submission window only.</w:t>
+              <w:t xml:space="preserve"> One hourly rate of USD 450 for every lawyer, from partner to associate. Netflix pays the same whether a partner or an associate does the work, so we have every incentive to staff each task at the right level.</w:t>
             </w:r>
           </w:p>
           <w:p>
@@ -8512,7 +8491,7 @@
                 <w:sz w:val="20"/>
                 <w:szCs w:val="20"/>
               </w:rPr>
-              <w:t xml:space="preserve">Transparent.</w:t>
+              <w:t xml:space="preserve">Predictable.</w:t>
             </w:r>
             <w:r>
               <w:rPr>
@@ -8520,7 +8499,7 @@
                 <w:sz w:val="20"/>
                 <w:szCs w:val="20"/>
               </w:rPr>
-              <w:t xml:space="preserve"> Estimates in writing for every matter above 5 hours; alerts at 75% of budget; no charges for any item listed as prohibited in the Guidelines.</w:t>
+              <w:t xml:space="preserve"> The rate is fixed for three years from 1 January 2027, with no step or promotion increases, and any later adjustment is discussed with the Netflix Matter Lead within Netflix's annual rate submission window only.</w:t>
             </w:r>
           </w:p>
           <w:p>
@@ -8535,7 +8514,7 @@
                 <w:sz w:val="20"/>
                 <w:szCs w:val="20"/>
               </w:rPr>
-              <w:t xml:space="preserve">Competitive.</w:t>
+              <w:t xml:space="preserve">Transparent.</w:t>
             </w:r>
             <w:r>
               <w:rPr>
@@ -8543,24 +8522,7 @@
                 <w:sz w:val="20"/>
                 <w:szCs w:val="20"/>
               </w:rPr>
-              <w:t xml:space="preserve"> A Netflix discount of </w:t>
-            </w:r>
-            <w:r>
-              <w:rPr>
-                <w:rFonts w:ascii="Arial" w:cs="Arial" w:eastAsia="Arial" w:hAnsi="Arial"/>
-                <w:sz w:val="20"/>
-                <w:szCs w:val="20"/>
-                <w:shd w:fill="FFF200" w:color="auto" w:val="clear"/>
-              </w:rPr>
-              <w:t xml:space="preserve">[15–20]</w:t>
-            </w:r>
-            <w:r>
-              <w:rPr>
-                <w:rFonts w:ascii="Arial" w:cs="Arial" w:eastAsia="Arial" w:hAnsi="Arial"/>
-                <w:sz w:val="20"/>
-                <w:szCs w:val="20"/>
-              </w:rPr>
-              <w:t xml:space="preserve">% from standard rates, volume credits, and fixed or capped fees wherever the work is repeatable.</w:t>
+              <w:t xml:space="preserve"> Estimates in writing for every matter above 5 hours; alerts at 75% of budget; fixed fees agreed in writing before work starts; no charges for any item listed as prohibited in the Guidelines.</w:t>
             </w:r>
           </w:p>
           <w:p>
@@ -8583,7 +8545,7 @@
                 <w:sz w:val="20"/>
                 <w:szCs w:val="20"/>
               </w:rPr>
-              <w:t xml:space="preserve"> 5% of quarterly fees held at risk against the KPI scorecard in Section 15.</w:t>
+              <w:t xml:space="preserve"> Volume credits on annual fees and 5% of quarterly fees held at risk against the KPI scorecard in Section 15.</w:t>
             </w:r>
           </w:p>
         </w:tc>
@@ -8601,30 +8563,7 @@
         <w:spacing w:after="120" w:before="240"/>
       </w:pPr>
       <w:r>
-        <w:t xml:space="preserve">11.1 Discounted hourly rate card</w:t>
-      </w:r>
-    </w:p>
-    <w:p>
-      <w:pPr>
-        <w:spacing w:after="140" w:line="276"/>
-        <w:jc w:val="left"/>
-      </w:pPr>
-      <w:r>
-        <w:rPr>
-          <w:rFonts w:ascii="Arial" w:cs="Arial" w:eastAsia="Arial" w:hAnsi="Arial"/>
-          <w:sz w:val="21"/>
-          <w:szCs w:val="21"/>
-        </w:rPr>
-        <w:t xml:space="preserve">Indicative rates in US dollars, effective 1 January 2027 and fixed until 31 December 2029. Rates for any Dentons office outside Dentons KMN will be submitted to Legal Tracker for approval before any work is billed and will carry at least the same percentage discount. </w:t>
-      </w:r>
-      <w:r>
-        <w:rPr>
-          <w:rFonts w:ascii="Arial" w:cs="Arial" w:eastAsia="Arial" w:hAnsi="Arial"/>
-          <w:sz w:val="21"/>
-          <w:szCs w:val="21"/>
-          <w:shd w:fill="FFF200" w:color="auto" w:val="clear"/>
-        </w:rPr>
-        <w:t xml:space="preserve">[Confirm final figures before submission.]</w:t>
+        <w:t xml:space="preserve">11.1 Hourly rate</w:t>
       </w:r>
     </w:p>
     <w:tbl>
@@ -8640,10 +8579,10 @@
         </w:tblBorders>
       </w:tblPr>
       <w:tblGrid>
-        <w:gridCol w:w="3300"/>
-        <w:gridCol w:w="2100"/>
-        <w:gridCol w:w="1800"/>
-        <w:gridCol w:w="2160"/>
+        <w:gridCol w:w="3900"/>
+        <w:gridCol w:w="2600"/>
+        <w:gridCol w:w="1400"/>
+        <w:gridCol w:w="1460"/>
       </w:tblGrid>
       <w:tr>
         <w:trPr>
@@ -8652,7 +8591,7 @@
         </w:trPr>
         <w:tc>
           <w:tcPr>
-            <w:tcW w:type="dxa" w:w="3300"/>
+            <w:tcW w:type="dxa" w:w="3900"/>
             <w:shd w:fill="5B2A86" w:color="auto" w:val="clear"/>
             <w:tcMar>
               <w:top w:type="dxa" w:w="70"/>
@@ -8676,13 +8615,13 @@
                 <w:sz w:val="19"/>
                 <w:szCs w:val="19"/>
               </w:rPr>
-              <w:t xml:space="preserve">Timekeeper level</w:t>
-            </w:r>
-          </w:p>
-        </w:tc>
-        <w:tc>
-          <w:tcPr>
-            <w:tcW w:type="dxa" w:w="2100"/>
+              <w:t xml:space="preserve">Timekeeper</w:t>
+            </w:r>
+          </w:p>
+        </w:tc>
+        <w:tc>
+          <w:tcPr>
+            <w:tcW w:type="dxa" w:w="2600"/>
             <w:shd w:fill="5B2A86" w:color="auto" w:val="clear"/>
             <w:tcMar>
               <w:top w:type="dxa" w:w="70"/>
@@ -8706,13 +8645,13 @@
                 <w:sz w:val="19"/>
                 <w:szCs w:val="19"/>
               </w:rPr>
-              <w:t xml:space="preserve">Standard rate (USD/hr)</w:t>
-            </w:r>
-          </w:p>
-        </w:tc>
-        <w:tc>
-          <w:tcPr>
-            <w:tcW w:type="dxa" w:w="1800"/>
+              <w:t xml:space="preserve">Rate (USD/hr)</w:t>
+            </w:r>
+          </w:p>
+        </w:tc>
+        <w:tc>
+          <w:tcPr>
+            <w:tcW w:type="dxa" w:w="1400"/>
             <w:shd w:fill="5B2A86" w:color="auto" w:val="clear"/>
             <w:tcMar>
               <w:top w:type="dxa" w:w="70"/>
@@ -8736,13 +8675,13 @@
                 <w:sz w:val="19"/>
                 <w:szCs w:val="19"/>
               </w:rPr>
-              <w:t xml:space="preserve">Netflix discount</w:t>
-            </w:r>
-          </w:p>
-        </w:tc>
-        <w:tc>
-          <w:tcPr>
-            <w:tcW w:type="dxa" w:w="2160"/>
+              <w:t xml:space="preserve">Effective</w:t>
+            </w:r>
+          </w:p>
+        </w:tc>
+        <w:tc>
+          <w:tcPr>
+            <w:tcW w:type="dxa" w:w="1460"/>
             <w:shd w:fill="5B2A86" w:color="auto" w:val="clear"/>
             <w:tcMar>
               <w:top w:type="dxa" w:w="70"/>
@@ -8766,7 +8705,7 @@
                 <w:sz w:val="19"/>
                 <w:szCs w:val="19"/>
               </w:rPr>
-              <w:t xml:space="preserve">Netflix rate (USD/hr)</w:t>
+              <w:t xml:space="preserve">Fixed until</w:t>
             </w:r>
           </w:p>
         </w:tc>
@@ -8778,108 +8717,105 @@
         </w:trPr>
         <w:tc>
           <w:tcPr>
-            <w:tcW w:type="dxa" w:w="3300"/>
-            <w:tcMar>
-              <w:top w:type="dxa" w:w="70"/>
-              <w:left w:type="dxa" w:w="110"/>
-              <w:bottom w:type="dxa" w:w="70"/>
-              <w:right w:type="dxa" w:w="110"/>
-            </w:tcMar>
-            <w:vAlign w:val="top"/>
-          </w:tcPr>
-          <w:p>
-            <w:pPr>
-              <w:spacing w:after="40" w:line="252"/>
-              <w:jc w:val="left"/>
-            </w:pPr>
-            <w:r>
-              <w:rPr>
-                <w:rFonts w:ascii="Arial" w:cs="Arial" w:eastAsia="Arial" w:hAnsi="Arial"/>
-                <w:sz w:val="19"/>
-                <w:szCs w:val="19"/>
-              </w:rPr>
-              <w:t xml:space="preserve">Partner</w:t>
-            </w:r>
-          </w:p>
-        </w:tc>
-        <w:tc>
-          <w:tcPr>
-            <w:tcW w:type="dxa" w:w="2100"/>
-            <w:tcMar>
-              <w:top w:type="dxa" w:w="70"/>
-              <w:left w:type="dxa" w:w="110"/>
-              <w:bottom w:type="dxa" w:w="70"/>
-              <w:right w:type="dxa" w:w="110"/>
-            </w:tcMar>
-            <w:vAlign w:val="top"/>
-          </w:tcPr>
-          <w:p>
-            <w:pPr>
-              <w:spacing w:after="40" w:line="252"/>
-              <w:jc w:val="left"/>
-            </w:pPr>
-            <w:r>
-              <w:rPr>
-                <w:rFonts w:ascii="Arial" w:cs="Arial" w:eastAsia="Arial" w:hAnsi="Arial"/>
-                <w:sz w:val="19"/>
-                <w:szCs w:val="19"/>
-                <w:shd w:fill="FFF200" w:color="auto" w:val="clear"/>
-              </w:rPr>
-              <w:t xml:space="preserve">[750]</w:t>
-            </w:r>
-          </w:p>
-        </w:tc>
-        <w:tc>
-          <w:tcPr>
-            <w:tcW w:type="dxa" w:w="1800"/>
-            <w:tcMar>
-              <w:top w:type="dxa" w:w="70"/>
-              <w:left w:type="dxa" w:w="110"/>
-              <w:bottom w:type="dxa" w:w="70"/>
-              <w:right w:type="dxa" w:w="110"/>
-            </w:tcMar>
-            <w:vAlign w:val="top"/>
-          </w:tcPr>
-          <w:p>
-            <w:pPr>
-              <w:spacing w:after="40" w:line="252"/>
-              <w:jc w:val="left"/>
-            </w:pPr>
-            <w:r>
-              <w:rPr>
-                <w:rFonts w:ascii="Arial" w:cs="Arial" w:eastAsia="Arial" w:hAnsi="Arial"/>
-                <w:sz w:val="19"/>
-                <w:szCs w:val="19"/>
-                <w:shd w:fill="FFF200" w:color="auto" w:val="clear"/>
-              </w:rPr>
-              <w:t xml:space="preserve">[17.5%]</w:t>
-            </w:r>
-          </w:p>
-        </w:tc>
-        <w:tc>
-          <w:tcPr>
-            <w:tcW w:type="dxa" w:w="2160"/>
-            <w:tcMar>
-              <w:top w:type="dxa" w:w="70"/>
-              <w:left w:type="dxa" w:w="110"/>
-              <w:bottom w:type="dxa" w:w="70"/>
-              <w:right w:type="dxa" w:w="110"/>
-            </w:tcMar>
-            <w:vAlign w:val="top"/>
-          </w:tcPr>
-          <w:p>
-            <w:pPr>
-              <w:spacing w:after="40" w:line="252"/>
-              <w:jc w:val="left"/>
-            </w:pPr>
-            <w:r>
-              <w:rPr>
-                <w:rFonts w:ascii="Arial" w:cs="Arial" w:eastAsia="Arial" w:hAnsi="Arial"/>
-                <w:sz w:val="19"/>
-                <w:szCs w:val="19"/>
-                <w:shd w:fill="FFF200" w:color="auto" w:val="clear"/>
-              </w:rPr>
-              <w:t xml:space="preserve">[620]</w:t>
+            <w:tcW w:type="dxa" w:w="3900"/>
+            <w:tcMar>
+              <w:top w:type="dxa" w:w="70"/>
+              <w:left w:type="dxa" w:w="110"/>
+              <w:bottom w:type="dxa" w:w="70"/>
+              <w:right w:type="dxa" w:w="110"/>
+            </w:tcMar>
+            <w:vAlign w:val="top"/>
+          </w:tcPr>
+          <w:p>
+            <w:pPr>
+              <w:spacing w:after="40" w:line="252"/>
+              <w:jc w:val="left"/>
+            </w:pPr>
+            <w:r>
+              <w:rPr>
+                <w:rFonts w:ascii="Arial" w:cs="Arial" w:eastAsia="Arial" w:hAnsi="Arial"/>
+                <w:sz w:val="19"/>
+                <w:szCs w:val="19"/>
+              </w:rPr>
+              <w:t xml:space="preserve">All lawyer time (partners, counsel and associates)</w:t>
+            </w:r>
+          </w:p>
+        </w:tc>
+        <w:tc>
+          <w:tcPr>
+            <w:tcW w:type="dxa" w:w="2600"/>
+            <w:tcMar>
+              <w:top w:type="dxa" w:w="70"/>
+              <w:left w:type="dxa" w:w="110"/>
+              <w:bottom w:type="dxa" w:w="70"/>
+              <w:right w:type="dxa" w:w="110"/>
+            </w:tcMar>
+            <w:vAlign w:val="top"/>
+          </w:tcPr>
+          <w:p>
+            <w:pPr>
+              <w:spacing w:after="40" w:line="252"/>
+              <w:jc w:val="left"/>
+            </w:pPr>
+            <w:r>
+              <w:rPr>
+                <w:rFonts w:ascii="Arial" w:cs="Arial" w:eastAsia="Arial" w:hAnsi="Arial"/>
+                <w:sz w:val="19"/>
+                <w:szCs w:val="19"/>
+              </w:rPr>
+              <w:t xml:space="preserve">450</w:t>
+            </w:r>
+          </w:p>
+        </w:tc>
+        <w:tc>
+          <w:tcPr>
+            <w:tcW w:type="dxa" w:w="1400"/>
+            <w:tcMar>
+              <w:top w:type="dxa" w:w="70"/>
+              <w:left w:type="dxa" w:w="110"/>
+              <w:bottom w:type="dxa" w:w="70"/>
+              <w:right w:type="dxa" w:w="110"/>
+            </w:tcMar>
+            <w:vAlign w:val="top"/>
+          </w:tcPr>
+          <w:p>
+            <w:pPr>
+              <w:spacing w:after="40" w:line="252"/>
+              <w:jc w:val="left"/>
+            </w:pPr>
+            <w:r>
+              <w:rPr>
+                <w:rFonts w:ascii="Arial" w:cs="Arial" w:eastAsia="Arial" w:hAnsi="Arial"/>
+                <w:sz w:val="19"/>
+                <w:szCs w:val="19"/>
+              </w:rPr>
+              <w:t xml:space="preserve">1 January 2027</w:t>
+            </w:r>
+          </w:p>
+        </w:tc>
+        <w:tc>
+          <w:tcPr>
+            <w:tcW w:type="dxa" w:w="1460"/>
+            <w:tcMar>
+              <w:top w:type="dxa" w:w="70"/>
+              <w:left w:type="dxa" w:w="110"/>
+              <w:bottom w:type="dxa" w:w="70"/>
+              <w:right w:type="dxa" w:w="110"/>
+            </w:tcMar>
+            <w:vAlign w:val="top"/>
+          </w:tcPr>
+          <w:p>
+            <w:pPr>
+              <w:spacing w:after="40" w:line="252"/>
+              <w:jc w:val="left"/>
+            </w:pPr>
+            <w:r>
+              <w:rPr>
+                <w:rFonts w:ascii="Arial" w:cs="Arial" w:eastAsia="Arial" w:hAnsi="Arial"/>
+                <w:sz w:val="19"/>
+                <w:szCs w:val="19"/>
+              </w:rPr>
+              <w:t xml:space="preserve">31 December 2029</w:t>
             </w:r>
           </w:p>
         </w:tc>
@@ -8891,7 +8827,7 @@
         </w:trPr>
         <w:tc>
           <w:tcPr>
-            <w:tcW w:type="dxa" w:w="3300"/>
+            <w:tcW w:type="dxa" w:w="3900"/>
             <w:shd w:fill="F2F2F2" w:color="auto" w:val="clear"/>
             <w:tcMar>
               <w:top w:type="dxa" w:w="70"/>
@@ -8912,13 +8848,13 @@
                 <w:sz w:val="19"/>
                 <w:szCs w:val="19"/>
               </w:rPr>
-              <w:t xml:space="preserve">Of Counsel / Senior Counsel</w:t>
-            </w:r>
-          </w:p>
-        </w:tc>
-        <w:tc>
-          <w:tcPr>
-            <w:tcW w:type="dxa" w:w="2100"/>
+              <w:t xml:space="preserve">Paralegal and administrative support</w:t>
+            </w:r>
+          </w:p>
+        </w:tc>
+        <w:tc>
+          <w:tcPr>
+            <w:tcW w:type="dxa" w:w="2600"/>
             <w:shd w:fill="F2F2F2" w:color="auto" w:val="clear"/>
             <w:tcMar>
               <w:top w:type="dxa" w:w="70"/>
@@ -8938,15 +8874,14 @@
                 <w:rFonts w:ascii="Arial" w:cs="Arial" w:eastAsia="Arial" w:hAnsi="Arial"/>
                 <w:sz w:val="19"/>
                 <w:szCs w:val="19"/>
-                <w:shd w:fill="FFF200" w:color="auto" w:val="clear"/>
-              </w:rPr>
-              <w:t xml:space="preserve">[620]</w:t>
-            </w:r>
-          </w:p>
-        </w:tc>
-        <w:tc>
-          <w:tcPr>
-            <w:tcW w:type="dxa" w:w="1800"/>
+              </w:rPr>
+              <w:t xml:space="preserve">Not billed separately</w:t>
+            </w:r>
+          </w:p>
+        </w:tc>
+        <w:tc>
+          <w:tcPr>
+            <w:tcW w:type="dxa" w:w="1400"/>
             <w:shd w:fill="F2F2F2" w:color="auto" w:val="clear"/>
             <w:tcMar>
               <w:top w:type="dxa" w:w="70"/>
@@ -8966,15 +8901,14 @@
                 <w:rFonts w:ascii="Arial" w:cs="Arial" w:eastAsia="Arial" w:hAnsi="Arial"/>
                 <w:sz w:val="19"/>
                 <w:szCs w:val="19"/>
-                <w:shd w:fill="FFF200" w:color="auto" w:val="clear"/>
-              </w:rPr>
-              <w:t xml:space="preserve">[16%]</w:t>
-            </w:r>
-          </w:p>
-        </w:tc>
-        <w:tc>
-          <w:tcPr>
-            <w:tcW w:type="dxa" w:w="2160"/>
+              </w:rPr>
+              <w:t xml:space="preserve">—</w:t>
+            </w:r>
+          </w:p>
+        </w:tc>
+        <w:tc>
+          <w:tcPr>
+            <w:tcW w:type="dxa" w:w="1460"/>
             <w:shd w:fill="F2F2F2" w:color="auto" w:val="clear"/>
             <w:tcMar>
               <w:top w:type="dxa" w:w="70"/>
@@ -8994,9 +8928,8 @@
                 <w:rFonts w:ascii="Arial" w:cs="Arial" w:eastAsia="Arial" w:hAnsi="Arial"/>
                 <w:sz w:val="19"/>
                 <w:szCs w:val="19"/>
-                <w:shd w:fill="FFF200" w:color="auto" w:val="clear"/>
-              </w:rPr>
-              <w:t xml:space="preserve">[520]</w:t>
+              </w:rPr>
+              <w:t xml:space="preserve">—</w:t>
             </w:r>
           </w:p>
         </w:tc>
@@ -9008,568 +8941,105 @@
         </w:trPr>
         <w:tc>
           <w:tcPr>
-            <w:tcW w:type="dxa" w:w="3300"/>
-            <w:tcMar>
-              <w:top w:type="dxa" w:w="70"/>
-              <w:left w:type="dxa" w:w="110"/>
-              <w:bottom w:type="dxa" w:w="70"/>
-              <w:right w:type="dxa" w:w="110"/>
-            </w:tcMar>
-            <w:vAlign w:val="top"/>
-          </w:tcPr>
-          <w:p>
-            <w:pPr>
-              <w:spacing w:after="40" w:line="252"/>
-              <w:jc w:val="left"/>
-            </w:pPr>
-            <w:r>
-              <w:rPr>
-                <w:rFonts w:ascii="Arial" w:cs="Arial" w:eastAsia="Arial" w:hAnsi="Arial"/>
-                <w:sz w:val="19"/>
-                <w:szCs w:val="19"/>
-              </w:rPr>
-              <w:t xml:space="preserve">Senior Associate (6+ years)</w:t>
-            </w:r>
-          </w:p>
-        </w:tc>
-        <w:tc>
-          <w:tcPr>
-            <w:tcW w:type="dxa" w:w="2100"/>
-            <w:tcMar>
-              <w:top w:type="dxa" w:w="70"/>
-              <w:left w:type="dxa" w:w="110"/>
-              <w:bottom w:type="dxa" w:w="70"/>
-              <w:right w:type="dxa" w:w="110"/>
-            </w:tcMar>
-            <w:vAlign w:val="top"/>
-          </w:tcPr>
-          <w:p>
-            <w:pPr>
-              <w:spacing w:after="40" w:line="252"/>
-              <w:jc w:val="left"/>
-            </w:pPr>
-            <w:r>
-              <w:rPr>
-                <w:rFonts w:ascii="Arial" w:cs="Arial" w:eastAsia="Arial" w:hAnsi="Arial"/>
-                <w:sz w:val="19"/>
-                <w:szCs w:val="19"/>
-                <w:shd w:fill="FFF200" w:color="auto" w:val="clear"/>
-              </w:rPr>
-              <w:t xml:space="preserve">[480]</w:t>
-            </w:r>
-          </w:p>
-        </w:tc>
-        <w:tc>
-          <w:tcPr>
-            <w:tcW w:type="dxa" w:w="1800"/>
-            <w:tcMar>
-              <w:top w:type="dxa" w:w="70"/>
-              <w:left w:type="dxa" w:w="110"/>
-              <w:bottom w:type="dxa" w:w="70"/>
-              <w:right w:type="dxa" w:w="110"/>
-            </w:tcMar>
-            <w:vAlign w:val="top"/>
-          </w:tcPr>
-          <w:p>
-            <w:pPr>
-              <w:spacing w:after="40" w:line="252"/>
-              <w:jc w:val="left"/>
-            </w:pPr>
-            <w:r>
-              <w:rPr>
-                <w:rFonts w:ascii="Arial" w:cs="Arial" w:eastAsia="Arial" w:hAnsi="Arial"/>
-                <w:sz w:val="19"/>
-                <w:szCs w:val="19"/>
-                <w:shd w:fill="FFF200" w:color="auto" w:val="clear"/>
-              </w:rPr>
-              <w:t xml:space="preserve">[17%]</w:t>
-            </w:r>
-          </w:p>
-        </w:tc>
-        <w:tc>
-          <w:tcPr>
-            <w:tcW w:type="dxa" w:w="2160"/>
-            <w:tcMar>
-              <w:top w:type="dxa" w:w="70"/>
-              <w:left w:type="dxa" w:w="110"/>
-              <w:bottom w:type="dxa" w:w="70"/>
-              <w:right w:type="dxa" w:w="110"/>
-            </w:tcMar>
-            <w:vAlign w:val="top"/>
-          </w:tcPr>
-          <w:p>
-            <w:pPr>
-              <w:spacing w:after="40" w:line="252"/>
-              <w:jc w:val="left"/>
-            </w:pPr>
-            <w:r>
-              <w:rPr>
-                <w:rFonts w:ascii="Arial" w:cs="Arial" w:eastAsia="Arial" w:hAnsi="Arial"/>
-                <w:sz w:val="19"/>
-                <w:szCs w:val="19"/>
-                <w:shd w:fill="FFF200" w:color="auto" w:val="clear"/>
-              </w:rPr>
-              <w:t xml:space="preserve">[400]</w:t>
-            </w:r>
-          </w:p>
-        </w:tc>
-      </w:tr>
-      <w:tr>
-        <w:trPr>
-          <w:cantSplit/>
-          <w:tblHeader w:val="false"/>
-        </w:trPr>
-        <w:tc>
-          <w:tcPr>
-            <w:tcW w:type="dxa" w:w="3300"/>
-            <w:shd w:fill="F2F2F2" w:color="auto" w:val="clear"/>
-            <w:tcMar>
-              <w:top w:type="dxa" w:w="70"/>
-              <w:left w:type="dxa" w:w="110"/>
-              <w:bottom w:type="dxa" w:w="70"/>
-              <w:right w:type="dxa" w:w="110"/>
-            </w:tcMar>
-            <w:vAlign w:val="top"/>
-          </w:tcPr>
-          <w:p>
-            <w:pPr>
-              <w:spacing w:after="40" w:line="252"/>
-              <w:jc w:val="left"/>
-            </w:pPr>
-            <w:r>
-              <w:rPr>
-                <w:rFonts w:ascii="Arial" w:cs="Arial" w:eastAsia="Arial" w:hAnsi="Arial"/>
-                <w:sz w:val="19"/>
-                <w:szCs w:val="19"/>
-              </w:rPr>
-              <w:t xml:space="preserve">Associate (3–5 years)</w:t>
-            </w:r>
-          </w:p>
-        </w:tc>
-        <w:tc>
-          <w:tcPr>
-            <w:tcW w:type="dxa" w:w="2100"/>
-            <w:shd w:fill="F2F2F2" w:color="auto" w:val="clear"/>
-            <w:tcMar>
-              <w:top w:type="dxa" w:w="70"/>
-              <w:left w:type="dxa" w:w="110"/>
-              <w:bottom w:type="dxa" w:w="70"/>
-              <w:right w:type="dxa" w:w="110"/>
-            </w:tcMar>
-            <w:vAlign w:val="top"/>
-          </w:tcPr>
-          <w:p>
-            <w:pPr>
-              <w:spacing w:after="40" w:line="252"/>
-              <w:jc w:val="left"/>
-            </w:pPr>
-            <w:r>
-              <w:rPr>
-                <w:rFonts w:ascii="Arial" w:cs="Arial" w:eastAsia="Arial" w:hAnsi="Arial"/>
-                <w:sz w:val="19"/>
-                <w:szCs w:val="19"/>
-                <w:shd w:fill="FFF200" w:color="auto" w:val="clear"/>
-              </w:rPr>
-              <w:t xml:space="preserve">[380]</w:t>
-            </w:r>
-          </w:p>
-        </w:tc>
-        <w:tc>
-          <w:tcPr>
-            <w:tcW w:type="dxa" w:w="1800"/>
-            <w:shd w:fill="F2F2F2" w:color="auto" w:val="clear"/>
-            <w:tcMar>
-              <w:top w:type="dxa" w:w="70"/>
-              <w:left w:type="dxa" w:w="110"/>
-              <w:bottom w:type="dxa" w:w="70"/>
-              <w:right w:type="dxa" w:w="110"/>
-            </w:tcMar>
-            <w:vAlign w:val="top"/>
-          </w:tcPr>
-          <w:p>
-            <w:pPr>
-              <w:spacing w:after="40" w:line="252"/>
-              <w:jc w:val="left"/>
-            </w:pPr>
-            <w:r>
-              <w:rPr>
-                <w:rFonts w:ascii="Arial" w:cs="Arial" w:eastAsia="Arial" w:hAnsi="Arial"/>
-                <w:sz w:val="19"/>
-                <w:szCs w:val="19"/>
-                <w:shd w:fill="FFF200" w:color="auto" w:val="clear"/>
-              </w:rPr>
-              <w:t xml:space="preserve">[17%]</w:t>
-            </w:r>
-          </w:p>
-        </w:tc>
-        <w:tc>
-          <w:tcPr>
-            <w:tcW w:type="dxa" w:w="2160"/>
-            <w:shd w:fill="F2F2F2" w:color="auto" w:val="clear"/>
-            <w:tcMar>
-              <w:top w:type="dxa" w:w="70"/>
-              <w:left w:type="dxa" w:w="110"/>
-              <w:bottom w:type="dxa" w:w="70"/>
-              <w:right w:type="dxa" w:w="110"/>
-            </w:tcMar>
-            <w:vAlign w:val="top"/>
-          </w:tcPr>
-          <w:p>
-            <w:pPr>
-              <w:spacing w:after="40" w:line="252"/>
-              <w:jc w:val="left"/>
-            </w:pPr>
-            <w:r>
-              <w:rPr>
-                <w:rFonts w:ascii="Arial" w:cs="Arial" w:eastAsia="Arial" w:hAnsi="Arial"/>
-                <w:sz w:val="19"/>
-                <w:szCs w:val="19"/>
-                <w:shd w:fill="FFF200" w:color="auto" w:val="clear"/>
-              </w:rPr>
-              <w:t xml:space="preserve">[315]</w:t>
-            </w:r>
-          </w:p>
-        </w:tc>
-      </w:tr>
-      <w:tr>
-        <w:trPr>
-          <w:cantSplit/>
-          <w:tblHeader w:val="false"/>
-        </w:trPr>
-        <w:tc>
-          <w:tcPr>
-            <w:tcW w:type="dxa" w:w="3300"/>
-            <w:tcMar>
-              <w:top w:type="dxa" w:w="70"/>
-              <w:left w:type="dxa" w:w="110"/>
-              <w:bottom w:type="dxa" w:w="70"/>
-              <w:right w:type="dxa" w:w="110"/>
-            </w:tcMar>
-            <w:vAlign w:val="top"/>
-          </w:tcPr>
-          <w:p>
-            <w:pPr>
-              <w:spacing w:after="40" w:line="252"/>
-              <w:jc w:val="left"/>
-            </w:pPr>
-            <w:r>
-              <w:rPr>
-                <w:rFonts w:ascii="Arial" w:cs="Arial" w:eastAsia="Arial" w:hAnsi="Arial"/>
-                <w:sz w:val="19"/>
-                <w:szCs w:val="19"/>
-              </w:rPr>
-              <w:t xml:space="preserve">Attorney-Translator (qualified lawyer)</w:t>
-            </w:r>
-          </w:p>
-        </w:tc>
-        <w:tc>
-          <w:tcPr>
-            <w:tcW w:type="dxa" w:w="2100"/>
-            <w:tcMar>
-              <w:top w:type="dxa" w:w="70"/>
-              <w:left w:type="dxa" w:w="110"/>
-              <w:bottom w:type="dxa" w:w="70"/>
-              <w:right w:type="dxa" w:w="110"/>
-            </w:tcMar>
-            <w:vAlign w:val="top"/>
-          </w:tcPr>
-          <w:p>
-            <w:pPr>
-              <w:spacing w:after="40" w:line="252"/>
-              <w:jc w:val="left"/>
-            </w:pPr>
-            <w:r>
-              <w:rPr>
-                <w:rFonts w:ascii="Arial" w:cs="Arial" w:eastAsia="Arial" w:hAnsi="Arial"/>
-                <w:sz w:val="19"/>
-                <w:szCs w:val="19"/>
-                <w:shd w:fill="FFF200" w:color="auto" w:val="clear"/>
-              </w:rPr>
-              <w:t xml:space="preserve">[380]</w:t>
-            </w:r>
-          </w:p>
-        </w:tc>
-        <w:tc>
-          <w:tcPr>
-            <w:tcW w:type="dxa" w:w="1800"/>
-            <w:tcMar>
-              <w:top w:type="dxa" w:w="70"/>
-              <w:left w:type="dxa" w:w="110"/>
-              <w:bottom w:type="dxa" w:w="70"/>
-              <w:right w:type="dxa" w:w="110"/>
-            </w:tcMar>
-            <w:vAlign w:val="top"/>
-          </w:tcPr>
-          <w:p>
-            <w:pPr>
-              <w:spacing w:after="40" w:line="252"/>
-              <w:jc w:val="left"/>
-            </w:pPr>
-            <w:r>
-              <w:rPr>
-                <w:rFonts w:ascii="Arial" w:cs="Arial" w:eastAsia="Arial" w:hAnsi="Arial"/>
-                <w:sz w:val="19"/>
-                <w:szCs w:val="19"/>
-                <w:shd w:fill="FFF200" w:color="auto" w:val="clear"/>
-              </w:rPr>
-              <w:t xml:space="preserve">[17%]</w:t>
-            </w:r>
-          </w:p>
-        </w:tc>
-        <w:tc>
-          <w:tcPr>
-            <w:tcW w:type="dxa" w:w="2160"/>
-            <w:tcMar>
-              <w:top w:type="dxa" w:w="70"/>
-              <w:left w:type="dxa" w:w="110"/>
-              <w:bottom w:type="dxa" w:w="70"/>
-              <w:right w:type="dxa" w:w="110"/>
-            </w:tcMar>
-            <w:vAlign w:val="top"/>
-          </w:tcPr>
-          <w:p>
-            <w:pPr>
-              <w:spacing w:after="40" w:line="252"/>
-              <w:jc w:val="left"/>
-            </w:pPr>
-            <w:r>
-              <w:rPr>
-                <w:rFonts w:ascii="Arial" w:cs="Arial" w:eastAsia="Arial" w:hAnsi="Arial"/>
-                <w:sz w:val="19"/>
-                <w:szCs w:val="19"/>
-                <w:shd w:fill="FFF200" w:color="auto" w:val="clear"/>
-              </w:rPr>
-              <w:t xml:space="preserve">[315]</w:t>
-            </w:r>
-          </w:p>
-        </w:tc>
-      </w:tr>
-      <w:tr>
-        <w:trPr>
-          <w:cantSplit/>
-          <w:tblHeader w:val="false"/>
-        </w:trPr>
-        <w:tc>
-          <w:tcPr>
-            <w:tcW w:type="dxa" w:w="3300"/>
-            <w:shd w:fill="F2F2F2" w:color="auto" w:val="clear"/>
-            <w:tcMar>
-              <w:top w:type="dxa" w:w="70"/>
-              <w:left w:type="dxa" w:w="110"/>
-              <w:bottom w:type="dxa" w:w="70"/>
-              <w:right w:type="dxa" w:w="110"/>
-            </w:tcMar>
-            <w:vAlign w:val="top"/>
-          </w:tcPr>
-          <w:p>
-            <w:pPr>
-              <w:spacing w:after="40" w:line="252"/>
-              <w:jc w:val="left"/>
-            </w:pPr>
-            <w:r>
-              <w:rPr>
-                <w:rFonts w:ascii="Arial" w:cs="Arial" w:eastAsia="Arial" w:hAnsi="Arial"/>
-                <w:sz w:val="19"/>
-                <w:szCs w:val="19"/>
-              </w:rPr>
-              <w:t xml:space="preserve">Patent Agent / Technical Specialist</w:t>
-            </w:r>
-          </w:p>
-        </w:tc>
-        <w:tc>
-          <w:tcPr>
-            <w:tcW w:type="dxa" w:w="2100"/>
-            <w:shd w:fill="F2F2F2" w:color="auto" w:val="clear"/>
-            <w:tcMar>
-              <w:top w:type="dxa" w:w="70"/>
-              <w:left w:type="dxa" w:w="110"/>
-              <w:bottom w:type="dxa" w:w="70"/>
-              <w:right w:type="dxa" w:w="110"/>
-            </w:tcMar>
-            <w:vAlign w:val="top"/>
-          </w:tcPr>
-          <w:p>
-            <w:pPr>
-              <w:spacing w:after="40" w:line="252"/>
-              <w:jc w:val="left"/>
-            </w:pPr>
-            <w:r>
-              <w:rPr>
-                <w:rFonts w:ascii="Arial" w:cs="Arial" w:eastAsia="Arial" w:hAnsi="Arial"/>
-                <w:sz w:val="19"/>
-                <w:szCs w:val="19"/>
-                <w:shd w:fill="FFF200" w:color="auto" w:val="clear"/>
-              </w:rPr>
-              <w:t xml:space="preserve">[340]</w:t>
-            </w:r>
-          </w:p>
-        </w:tc>
-        <w:tc>
-          <w:tcPr>
-            <w:tcW w:type="dxa" w:w="1800"/>
-            <w:shd w:fill="F2F2F2" w:color="auto" w:val="clear"/>
-            <w:tcMar>
-              <w:top w:type="dxa" w:w="70"/>
-              <w:left w:type="dxa" w:w="110"/>
-              <w:bottom w:type="dxa" w:w="70"/>
-              <w:right w:type="dxa" w:w="110"/>
-            </w:tcMar>
-            <w:vAlign w:val="top"/>
-          </w:tcPr>
-          <w:p>
-            <w:pPr>
-              <w:spacing w:after="40" w:line="252"/>
-              <w:jc w:val="left"/>
-            </w:pPr>
-            <w:r>
-              <w:rPr>
-                <w:rFonts w:ascii="Arial" w:cs="Arial" w:eastAsia="Arial" w:hAnsi="Arial"/>
-                <w:sz w:val="19"/>
-                <w:szCs w:val="19"/>
-                <w:shd w:fill="FFF200" w:color="auto" w:val="clear"/>
-              </w:rPr>
-              <w:t xml:space="preserve">[15%]</w:t>
-            </w:r>
-          </w:p>
-        </w:tc>
-        <w:tc>
-          <w:tcPr>
-            <w:tcW w:type="dxa" w:w="2160"/>
-            <w:shd w:fill="F2F2F2" w:color="auto" w:val="clear"/>
-            <w:tcMar>
-              <w:top w:type="dxa" w:w="70"/>
-              <w:left w:type="dxa" w:w="110"/>
-              <w:bottom w:type="dxa" w:w="70"/>
-              <w:right w:type="dxa" w:w="110"/>
-            </w:tcMar>
-            <w:vAlign w:val="top"/>
-          </w:tcPr>
-          <w:p>
-            <w:pPr>
-              <w:spacing w:after="40" w:line="252"/>
-              <w:jc w:val="left"/>
-            </w:pPr>
-            <w:r>
-              <w:rPr>
-                <w:rFonts w:ascii="Arial" w:cs="Arial" w:eastAsia="Arial" w:hAnsi="Arial"/>
-                <w:sz w:val="19"/>
-                <w:szCs w:val="19"/>
-                <w:shd w:fill="FFF200" w:color="auto" w:val="clear"/>
-              </w:rPr>
-              <w:t xml:space="preserve">[290]</w:t>
-            </w:r>
-          </w:p>
-        </w:tc>
-      </w:tr>
-      <w:tr>
-        <w:trPr>
-          <w:cantSplit/>
-          <w:tblHeader w:val="false"/>
-        </w:trPr>
-        <w:tc>
-          <w:tcPr>
-            <w:tcW w:type="dxa" w:w="3300"/>
-            <w:tcMar>
-              <w:top w:type="dxa" w:w="70"/>
-              <w:left w:type="dxa" w:w="110"/>
-              <w:bottom w:type="dxa" w:w="70"/>
-              <w:right w:type="dxa" w:w="110"/>
-            </w:tcMar>
-            <w:vAlign w:val="top"/>
-          </w:tcPr>
-          <w:p>
-            <w:pPr>
-              <w:spacing w:after="40" w:line="252"/>
-              <w:jc w:val="left"/>
-            </w:pPr>
-            <w:r>
-              <w:rPr>
-                <w:rFonts w:ascii="Arial" w:cs="Arial" w:eastAsia="Arial" w:hAnsi="Arial"/>
-                <w:sz w:val="19"/>
-                <w:szCs w:val="19"/>
-              </w:rPr>
-              <w:t xml:space="preserve">Paralegal</w:t>
-            </w:r>
-          </w:p>
-        </w:tc>
-        <w:tc>
-          <w:tcPr>
-            <w:tcW w:type="dxa" w:w="2100"/>
-            <w:tcMar>
-              <w:top w:type="dxa" w:w="70"/>
-              <w:left w:type="dxa" w:w="110"/>
-              <w:bottom w:type="dxa" w:w="70"/>
-              <w:right w:type="dxa" w:w="110"/>
-            </w:tcMar>
-            <w:vAlign w:val="top"/>
-          </w:tcPr>
-          <w:p>
-            <w:pPr>
-              <w:spacing w:after="40" w:line="252"/>
-              <w:jc w:val="left"/>
-            </w:pPr>
-            <w:r>
-              <w:rPr>
-                <w:rFonts w:ascii="Arial" w:cs="Arial" w:eastAsia="Arial" w:hAnsi="Arial"/>
-                <w:sz w:val="19"/>
-                <w:szCs w:val="19"/>
-                <w:shd w:fill="FFF200" w:color="auto" w:val="clear"/>
-              </w:rPr>
-              <w:t xml:space="preserve">[180]</w:t>
-            </w:r>
-          </w:p>
-        </w:tc>
-        <w:tc>
-          <w:tcPr>
-            <w:tcW w:type="dxa" w:w="1800"/>
-            <w:tcMar>
-              <w:top w:type="dxa" w:w="70"/>
-              <w:left w:type="dxa" w:w="110"/>
-              <w:bottom w:type="dxa" w:w="70"/>
-              <w:right w:type="dxa" w:w="110"/>
-            </w:tcMar>
-            <w:vAlign w:val="top"/>
-          </w:tcPr>
-          <w:p>
-            <w:pPr>
-              <w:spacing w:after="40" w:line="252"/>
-              <w:jc w:val="left"/>
-            </w:pPr>
-            <w:r>
-              <w:rPr>
-                <w:rFonts w:ascii="Arial" w:cs="Arial" w:eastAsia="Arial" w:hAnsi="Arial"/>
-                <w:sz w:val="19"/>
-                <w:szCs w:val="19"/>
-                <w:shd w:fill="FFF200" w:color="auto" w:val="clear"/>
-              </w:rPr>
-              <w:t xml:space="preserve">[17%]</w:t>
-            </w:r>
-          </w:p>
-        </w:tc>
-        <w:tc>
-          <w:tcPr>
-            <w:tcW w:type="dxa" w:w="2160"/>
-            <w:tcMar>
-              <w:top w:type="dxa" w:w="70"/>
-              <w:left w:type="dxa" w:w="110"/>
-              <w:bottom w:type="dxa" w:w="70"/>
-              <w:right w:type="dxa" w:w="110"/>
-            </w:tcMar>
-            <w:vAlign w:val="top"/>
-          </w:tcPr>
-          <w:p>
-            <w:pPr>
-              <w:spacing w:after="40" w:line="252"/>
-              <w:jc w:val="left"/>
-            </w:pPr>
-            <w:r>
-              <w:rPr>
-                <w:rFonts w:ascii="Arial" w:cs="Arial" w:eastAsia="Arial" w:hAnsi="Arial"/>
-                <w:sz w:val="19"/>
-                <w:szCs w:val="19"/>
-                <w:shd w:fill="FFF200" w:color="auto" w:val="clear"/>
-              </w:rPr>
-              <w:t xml:space="preserve">[150]</w:t>
+            <w:tcW w:type="dxa" w:w="3900"/>
+            <w:tcMar>
+              <w:top w:type="dxa" w:w="70"/>
+              <w:left w:type="dxa" w:w="110"/>
+              <w:bottom w:type="dxa" w:w="70"/>
+              <w:right w:type="dxa" w:w="110"/>
+            </w:tcMar>
+            <w:vAlign w:val="top"/>
+          </w:tcPr>
+          <w:p>
+            <w:pPr>
+              <w:spacing w:after="40" w:line="252"/>
+              <w:jc w:val="left"/>
+            </w:pPr>
+            <w:r>
+              <w:rPr>
+                <w:rFonts w:ascii="Arial" w:cs="Arial" w:eastAsia="Arial" w:hAnsi="Arial"/>
+                <w:sz w:val="19"/>
+                <w:szCs w:val="19"/>
+              </w:rPr>
+              <w:t xml:space="preserve">Dentons offices outside Dentons KMN (e.g. patent prosecution, local-law input)</w:t>
+            </w:r>
+          </w:p>
+        </w:tc>
+        <w:tc>
+          <w:tcPr>
+            <w:tcW w:type="dxa" w:w="2600"/>
+            <w:tcMar>
+              <w:top w:type="dxa" w:w="70"/>
+              <w:left w:type="dxa" w:w="110"/>
+              <w:bottom w:type="dxa" w:w="70"/>
+              <w:right w:type="dxa" w:w="110"/>
+            </w:tcMar>
+            <w:vAlign w:val="top"/>
+          </w:tcPr>
+          <w:p>
+            <w:pPr>
+              <w:spacing w:after="40" w:line="252"/>
+              <w:jc w:val="left"/>
+            </w:pPr>
+            <w:r>
+              <w:rPr>
+                <w:rFonts w:ascii="Arial" w:cs="Arial" w:eastAsia="Arial" w:hAnsi="Arial"/>
+                <w:sz w:val="19"/>
+                <w:szCs w:val="19"/>
+              </w:rPr>
+              <w:t xml:space="preserve">Agreed with the Netflix Matter Lead and submitted to Legal Tracker before any work is billed</w:t>
+            </w:r>
+          </w:p>
+        </w:tc>
+        <w:tc>
+          <w:tcPr>
+            <w:tcW w:type="dxa" w:w="1400"/>
+            <w:tcMar>
+              <w:top w:type="dxa" w:w="70"/>
+              <w:left w:type="dxa" w:w="110"/>
+              <w:bottom w:type="dxa" w:w="70"/>
+              <w:right w:type="dxa" w:w="110"/>
+            </w:tcMar>
+            <w:vAlign w:val="top"/>
+          </w:tcPr>
+          <w:p>
+            <w:pPr>
+              <w:spacing w:after="40" w:line="252"/>
+              <w:jc w:val="left"/>
+            </w:pPr>
+            <w:r>
+              <w:rPr>
+                <w:rFonts w:ascii="Arial" w:cs="Arial" w:eastAsia="Arial" w:hAnsi="Arial"/>
+                <w:sz w:val="19"/>
+                <w:szCs w:val="19"/>
+              </w:rPr>
+              <w:t xml:space="preserve">1 January 2027</w:t>
+            </w:r>
+          </w:p>
+        </w:tc>
+        <w:tc>
+          <w:tcPr>
+            <w:tcW w:type="dxa" w:w="1460"/>
+            <w:tcMar>
+              <w:top w:type="dxa" w:w="70"/>
+              <w:left w:type="dxa" w:w="110"/>
+              <w:bottom w:type="dxa" w:w="70"/>
+              <w:right w:type="dxa" w:w="110"/>
+            </w:tcMar>
+            <w:vAlign w:val="top"/>
+          </w:tcPr>
+          <w:p>
+            <w:pPr>
+              <w:spacing w:after="40" w:line="252"/>
+              <w:jc w:val="left"/>
+            </w:pPr>
+            <w:r>
+              <w:rPr>
+                <w:rFonts w:ascii="Arial" w:cs="Arial" w:eastAsia="Arial" w:hAnsi="Arial"/>
+                <w:sz w:val="19"/>
+                <w:szCs w:val="19"/>
+              </w:rPr>
+              <w:t xml:space="preserve">31 December 2029</w:t>
             </w:r>
           </w:p>
         </w:tc>
@@ -9591,7 +9061,7 @@
           <w:sz w:val="21"/>
           <w:szCs w:val="21"/>
         </w:rPr>
-        <w:t xml:space="preserve">Associates in their first or second year of practice will not be staffed on Netflix matters without prior approval and are therefore not included in the rate card. Time is recorded in one-tenth-hour increments for actual time spent only.</w:t>
+        <w:t xml:space="preserve">Time is recorded in one-tenth-hour increments for actual time spent only. Associates in their first or second year of practice will not be staffed on Netflix matters without prior approval. For litigation matters, the rate submitted to a matter in Legal Tracker remains in effect for the life of the matter and for a minimum of three years, as the Guidelines require.</w:t>
       </w:r>
     </w:p>
     <w:p>
@@ -9601,7 +9071,7 @@
         <w:spacing w:after="120" w:before="240"/>
       </w:pPr>
       <w:r>
-        <w:t xml:space="preserve">11.2 Alternative fee arrangements</w:t>
+        <w:t xml:space="preserve">11.2 Fee models</w:t>
       </w:r>
     </w:p>
     <w:tbl>
@@ -9617,8 +9087,8 @@
         </w:tblBorders>
       </w:tblPr>
       <w:tblGrid>
-        <w:gridCol w:w="2500"/>
-        <w:gridCol w:w="2600"/>
+        <w:gridCol w:w="2300"/>
+        <w:gridCol w:w="2800"/>
         <w:gridCol w:w="4260"/>
       </w:tblGrid>
       <w:tr>
@@ -9628,7 +9098,7 @@
         </w:trPr>
         <w:tc>
           <w:tcPr>
-            <w:tcW w:type="dxa" w:w="2500"/>
+            <w:tcW w:type="dxa" w:w="2300"/>
             <w:shd w:fill="5B2A86" w:color="auto" w:val="clear"/>
             <w:tcMar>
               <w:top w:type="dxa" w:w="70"/>
@@ -9652,13 +9122,13 @@
                 <w:sz w:val="19"/>
                 <w:szCs w:val="19"/>
               </w:rPr>
-              <w:t xml:space="preserve">Option</w:t>
-            </w:r>
-          </w:p>
-        </w:tc>
-        <w:tc>
-          <w:tcPr>
-            <w:tcW w:type="dxa" w:w="2600"/>
+              <w:t xml:space="preserve">Model</w:t>
+            </w:r>
+          </w:p>
+        </w:tc>
+        <w:tc>
+          <w:tcPr>
+            <w:tcW w:type="dxa" w:w="2800"/>
             <w:shd w:fill="5B2A86" w:color="auto" w:val="clear"/>
             <w:tcMar>
               <w:top w:type="dxa" w:w="70"/>
@@ -9724,7 +9194,7 @@
         </w:trPr>
         <w:tc>
           <w:tcPr>
-            <w:tcW w:type="dxa" w:w="2500"/>
+            <w:tcW w:type="dxa" w:w="2300"/>
             <w:tcMar>
               <w:top w:type="dxa" w:w="70"/>
               <w:left w:type="dxa" w:w="110"/>
@@ -9750,27 +9220,27 @@
         </w:tc>
         <w:tc>
           <w:tcPr>
-            <w:tcW w:type="dxa" w:w="2600"/>
-            <w:tcMar>
-              <w:top w:type="dxa" w:w="70"/>
-              <w:left w:type="dxa" w:w="110"/>
-              <w:bottom w:type="dxa" w:w="70"/>
-              <w:right w:type="dxa" w:w="110"/>
-            </w:tcMar>
-            <w:vAlign w:val="top"/>
-          </w:tcPr>
-          <w:p>
-            <w:pPr>
-              <w:spacing w:after="40" w:line="252"/>
-              <w:jc w:val="left"/>
-            </w:pPr>
-            <w:r>
-              <w:rPr>
-                <w:rFonts w:ascii="Arial" w:cs="Arial" w:eastAsia="Arial" w:hAnsi="Arial"/>
-                <w:sz w:val="18"/>
-                <w:szCs w:val="18"/>
-              </w:rPr>
-              <w:t xml:space="preserve">Day-to-day privacy, consumer, marketing and product questions</w:t>
+            <w:tcW w:type="dxa" w:w="2800"/>
+            <w:tcMar>
+              <w:top w:type="dxa" w:w="70"/>
+              <w:left w:type="dxa" w:w="110"/>
+              <w:bottom w:type="dxa" w:w="70"/>
+              <w:right w:type="dxa" w:w="110"/>
+            </w:tcMar>
+            <w:vAlign w:val="top"/>
+          </w:tcPr>
+          <w:p>
+            <w:pPr>
+              <w:spacing w:after="40" w:line="252"/>
+              <w:jc w:val="left"/>
+            </w:pPr>
+            <w:r>
+              <w:rPr>
+                <w:rFonts w:ascii="Arial" w:cs="Arial" w:eastAsia="Arial" w:hAnsi="Arial"/>
+                <w:sz w:val="18"/>
+                <w:szCs w:val="18"/>
+              </w:rPr>
+              <w:t xml:space="preserve">Day-to-day privacy, consumer, marketing, product and translation questions</w:t>
             </w:r>
           </w:p>
         </w:tc>
@@ -9796,7 +9266,7 @@
                 <w:sz w:val="18"/>
                 <w:szCs w:val="18"/>
               </w:rPr>
-              <w:t xml:space="preserve">Fixed monthly fee for an agreed band of hours (e.g. up to 40, 80 or 150 hours per month) covering all advisory work across the scope; unused hours roll over one quarter; overage billed at the Netflix rate less a further 10%</w:t>
+              <w:t xml:space="preserve">A fixed monthly fee for an agreed band of hours. Bands are sized to the client's scale, industry and expected volume; for Netflix we propose three indicative bands (40, 80 and 150 hours per month) priced at the hourly rate less a subscription discount that increases with the band. Unused hours roll over one quarter; overage is billed at the hourly rate less 10%; the band is reviewed quarterly with the Matter Lead.</w:t>
             </w:r>
           </w:p>
         </w:tc>
@@ -9808,7 +9278,7 @@
         </w:trPr>
         <w:tc>
           <w:tcPr>
-            <w:tcW w:type="dxa" w:w="2500"/>
+            <w:tcW w:type="dxa" w:w="2300"/>
             <w:shd w:fill="F2F2F2" w:color="auto" w:val="clear"/>
             <w:tcMar>
               <w:top w:type="dxa" w:w="70"/>
@@ -9829,13 +9299,13 @@
                 <w:sz w:val="18"/>
                 <w:szCs w:val="18"/>
               </w:rPr>
-              <w:t xml:space="preserve">B. Fixed-fee translation menu</w:t>
-            </w:r>
-          </w:p>
-        </w:tc>
-        <w:tc>
-          <w:tcPr>
-            <w:tcW w:type="dxa" w:w="2600"/>
+              <w:t xml:space="preserve">B. Fixed fee per scope of work</w:t>
+            </w:r>
+          </w:p>
+        </w:tc>
+        <w:tc>
+          <w:tcPr>
+            <w:tcW w:type="dxa" w:w="2800"/>
             <w:shd w:fill="F2F2F2" w:color="auto" w:val="clear"/>
             <w:tcMar>
               <w:top w:type="dxa" w:w="70"/>
@@ -9856,7 +9326,7 @@
                 <w:sz w:val="18"/>
                 <w:szCs w:val="18"/>
               </w:rPr>
-              <w:t xml:space="preserve">Translation and legal review of privacy notices, terms, disclosures and other product documents</w:t>
+              <w:t xml:space="preserve">Any defined deliverable: a translation batch, a contract or template, a patent stage, a campaign review, a regulatory response, a user-flow review</w:t>
             </w:r>
           </w:p>
         </w:tc>
@@ -9883,7 +9353,7 @@
                 <w:sz w:val="18"/>
                 <w:szCs w:val="18"/>
               </w:rPr>
-              <w:t xml:space="preserve">Fixed fee per 1,000 source words by language tier, including second-attorney QA and glossary check; rush surcharge of 25% for 24-hour turnaround; legal review of an existing localization at a reduced per-word rate</w:t>
+              <w:t xml:space="preserve">At kick-off we quote a fixed fee based on the scope of work and the sector, agreed in writing before work starts. We absorb time above the fee; a re-scope is agreed only if the scope changes materially. Official fees and approved third-party costs are passed through at cost.</w:t>
             </w:r>
           </w:p>
         </w:tc>
@@ -9895,53 +9365,53 @@
         </w:trPr>
         <w:tc>
           <w:tcPr>
-            <w:tcW w:type="dxa" w:w="2500"/>
-            <w:tcMar>
-              <w:top w:type="dxa" w:w="70"/>
-              <w:left w:type="dxa" w:w="110"/>
-              <w:bottom w:type="dxa" w:w="70"/>
-              <w:right w:type="dxa" w:w="110"/>
-            </w:tcMar>
-            <w:vAlign w:val="top"/>
-          </w:tcPr>
-          <w:p>
-            <w:pPr>
-              <w:spacing w:after="40" w:line="252"/>
-              <w:jc w:val="left"/>
-            </w:pPr>
-            <w:r>
-              <w:rPr>
-                <w:rFonts w:ascii="Arial" w:cs="Arial" w:eastAsia="Arial" w:hAnsi="Arial"/>
-                <w:sz w:val="18"/>
-                <w:szCs w:val="18"/>
-              </w:rPr>
-              <w:t xml:space="preserve">C. Capped fees for product contracts</w:t>
-            </w:r>
-          </w:p>
-        </w:tc>
-        <w:tc>
-          <w:tcPr>
-            <w:tcW w:type="dxa" w:w="2600"/>
-            <w:tcMar>
-              <w:top w:type="dxa" w:w="70"/>
-              <w:left w:type="dxa" w:w="110"/>
-              <w:bottom w:type="dxa" w:w="70"/>
-              <w:right w:type="dxa" w:w="110"/>
-            </w:tcMar>
-            <w:vAlign w:val="top"/>
-          </w:tcPr>
-          <w:p>
-            <w:pPr>
-              <w:spacing w:after="40" w:line="252"/>
-              <w:jc w:val="left"/>
-            </w:pPr>
-            <w:r>
-              <w:rPr>
-                <w:rFonts w:ascii="Arial" w:cs="Arial" w:eastAsia="Arial" w:hAnsi="Arial"/>
-                <w:sz w:val="18"/>
-                <w:szCs w:val="18"/>
-              </w:rPr>
-              <w:t xml:space="preserve">Device, platform, licensing, SaaS and DPA negotiations</w:t>
+            <w:tcW w:type="dxa" w:w="2300"/>
+            <w:tcMar>
+              <w:top w:type="dxa" w:w="70"/>
+              <w:left w:type="dxa" w:w="110"/>
+              <w:bottom w:type="dxa" w:w="70"/>
+              <w:right w:type="dxa" w:w="110"/>
+            </w:tcMar>
+            <w:vAlign w:val="top"/>
+          </w:tcPr>
+          <w:p>
+            <w:pPr>
+              <w:spacing w:after="40" w:line="252"/>
+              <w:jc w:val="left"/>
+            </w:pPr>
+            <w:r>
+              <w:rPr>
+                <w:rFonts w:ascii="Arial" w:cs="Arial" w:eastAsia="Arial" w:hAnsi="Arial"/>
+                <w:sz w:val="18"/>
+                <w:szCs w:val="18"/>
+              </w:rPr>
+              <w:t xml:space="preserve">C. Hourly</w:t>
+            </w:r>
+          </w:p>
+        </w:tc>
+        <w:tc>
+          <w:tcPr>
+            <w:tcW w:type="dxa" w:w="2800"/>
+            <w:tcMar>
+              <w:top w:type="dxa" w:w="70"/>
+              <w:left w:type="dxa" w:w="110"/>
+              <w:bottom w:type="dxa" w:w="70"/>
+              <w:right w:type="dxa" w:w="110"/>
+            </w:tcMar>
+            <w:vAlign w:val="top"/>
+          </w:tcPr>
+          <w:p>
+            <w:pPr>
+              <w:spacing w:after="40" w:line="252"/>
+              <w:jc w:val="left"/>
+            </w:pPr>
+            <w:r>
+              <w:rPr>
+                <w:rFonts w:ascii="Arial" w:cs="Arial" w:eastAsia="Arial" w:hAnsi="Arial"/>
+                <w:sz w:val="18"/>
+                <w:szCs w:val="18"/>
+              </w:rPr>
+              <w:t xml:space="preserve">Work that cannot be scoped in advance, including urgent negotiations and regulator deadlines</w:t>
             </w:r>
           </w:p>
         </w:tc>
@@ -9967,265 +9437,7 @@
                 <w:sz w:val="18"/>
                 <w:szCs w:val="18"/>
               </w:rPr>
-              <w:t xml:space="preserve">A cap per contract type agreed with the Matter Lead at kick-off (for example, standard SaaS agreement, platform partnership, data processing agreement); we absorb time above the cap; a re-scope is agreed only if the counterparty materially changes the deal</w:t>
-            </w:r>
-          </w:p>
-        </w:tc>
-      </w:tr>
-      <w:tr>
-        <w:trPr>
-          <w:cantSplit/>
-          <w:tblHeader w:val="false"/>
-        </w:trPr>
-        <w:tc>
-          <w:tcPr>
-            <w:tcW w:type="dxa" w:w="2500"/>
-            <w:shd w:fill="F2F2F2" w:color="auto" w:val="clear"/>
-            <w:tcMar>
-              <w:top w:type="dxa" w:w="70"/>
-              <w:left w:type="dxa" w:w="110"/>
-              <w:bottom w:type="dxa" w:w="70"/>
-              <w:right w:type="dxa" w:w="110"/>
-            </w:tcMar>
-            <w:vAlign w:val="top"/>
-          </w:tcPr>
-          <w:p>
-            <w:pPr>
-              <w:spacing w:after="40" w:line="252"/>
-              <w:jc w:val="left"/>
-            </w:pPr>
-            <w:r>
-              <w:rPr>
-                <w:rFonts w:ascii="Arial" w:cs="Arial" w:eastAsia="Arial" w:hAnsi="Arial"/>
-                <w:sz w:val="18"/>
-                <w:szCs w:val="18"/>
-              </w:rPr>
-              <w:t xml:space="preserve">D. Fixed fees per patent stage</w:t>
-            </w:r>
-          </w:p>
-        </w:tc>
-        <w:tc>
-          <w:tcPr>
-            <w:tcW w:type="dxa" w:w="2600"/>
-            <w:shd w:fill="F2F2F2" w:color="auto" w:val="clear"/>
-            <w:tcMar>
-              <w:top w:type="dxa" w:w="70"/>
-              <w:left w:type="dxa" w:w="110"/>
-              <w:bottom w:type="dxa" w:w="70"/>
-              <w:right w:type="dxa" w:w="110"/>
-            </w:tcMar>
-            <w:vAlign w:val="top"/>
-          </w:tcPr>
-          <w:p>
-            <w:pPr>
-              <w:spacing w:after="40" w:line="252"/>
-              <w:jc w:val="left"/>
-            </w:pPr>
-            <w:r>
-              <w:rPr>
-                <w:rFonts w:ascii="Arial" w:cs="Arial" w:eastAsia="Arial" w:hAnsi="Arial"/>
-                <w:sz w:val="18"/>
-                <w:szCs w:val="18"/>
-              </w:rPr>
-              <w:t xml:space="preserve">Patent drafting and prosecution</w:t>
-            </w:r>
-          </w:p>
-        </w:tc>
-        <w:tc>
-          <w:tcPr>
-            <w:tcW w:type="dxa" w:w="4260"/>
-            <w:shd w:fill="F2F2F2" w:color="auto" w:val="clear"/>
-            <w:tcMar>
-              <w:top w:type="dxa" w:w="70"/>
-              <w:left w:type="dxa" w:w="110"/>
-              <w:bottom w:type="dxa" w:w="70"/>
-              <w:right w:type="dxa" w:w="110"/>
-            </w:tcMar>
-            <w:vAlign w:val="top"/>
-          </w:tcPr>
-          <w:p>
-            <w:pPr>
-              <w:spacing w:after="40" w:line="252"/>
-              <w:jc w:val="left"/>
-            </w:pPr>
-            <w:r>
-              <w:rPr>
-                <w:rFonts w:ascii="Arial" w:cs="Arial" w:eastAsia="Arial" w:hAnsi="Arial"/>
-                <w:sz w:val="18"/>
-                <w:szCs w:val="18"/>
-              </w:rPr>
-              <w:t xml:space="preserve">Fixed fees for drafting, filing, each office action response and grant formalities; official fees and foreign associate charges passed through at cost with invoices attached</w:t>
-            </w:r>
-          </w:p>
-        </w:tc>
-      </w:tr>
-      <w:tr>
-        <w:trPr>
-          <w:cantSplit/>
-          <w:tblHeader w:val="false"/>
-        </w:trPr>
-        <w:tc>
-          <w:tcPr>
-            <w:tcW w:type="dxa" w:w="2500"/>
-            <w:tcMar>
-              <w:top w:type="dxa" w:w="70"/>
-              <w:left w:type="dxa" w:w="110"/>
-              <w:bottom w:type="dxa" w:w="70"/>
-              <w:right w:type="dxa" w:w="110"/>
-            </w:tcMar>
-            <w:vAlign w:val="top"/>
-          </w:tcPr>
-          <w:p>
-            <w:pPr>
-              <w:spacing w:after="40" w:line="252"/>
-              <w:jc w:val="left"/>
-            </w:pPr>
-            <w:r>
-              <w:rPr>
-                <w:rFonts w:ascii="Arial" w:cs="Arial" w:eastAsia="Arial" w:hAnsi="Arial"/>
-                <w:sz w:val="18"/>
-                <w:szCs w:val="18"/>
-              </w:rPr>
-              <w:t xml:space="preserve">E. Fixed-fee campaign pre-clearance</w:t>
-            </w:r>
-          </w:p>
-        </w:tc>
-        <w:tc>
-          <w:tcPr>
-            <w:tcW w:type="dxa" w:w="2600"/>
-            <w:tcMar>
-              <w:top w:type="dxa" w:w="70"/>
-              <w:left w:type="dxa" w:w="110"/>
-              <w:bottom w:type="dxa" w:w="70"/>
-              <w:right w:type="dxa" w:w="110"/>
-            </w:tcMar>
-            <w:vAlign w:val="top"/>
-          </w:tcPr>
-          <w:p>
-            <w:pPr>
-              <w:spacing w:after="40" w:line="252"/>
-              <w:jc w:val="left"/>
-            </w:pPr>
-            <w:r>
-              <w:rPr>
-                <w:rFonts w:ascii="Arial" w:cs="Arial" w:eastAsia="Arial" w:hAnsi="Arial"/>
-                <w:sz w:val="18"/>
-                <w:szCs w:val="18"/>
-              </w:rPr>
-              <w:t xml:space="preserve">Marketing campaign reviews</w:t>
-            </w:r>
-          </w:p>
-        </w:tc>
-        <w:tc>
-          <w:tcPr>
-            <w:tcW w:type="dxa" w:w="4260"/>
-            <w:tcMar>
-              <w:top w:type="dxa" w:w="70"/>
-              <w:left w:type="dxa" w:w="110"/>
-              <w:bottom w:type="dxa" w:w="70"/>
-              <w:right w:type="dxa" w:w="110"/>
-            </w:tcMar>
-            <w:vAlign w:val="top"/>
-          </w:tcPr>
-          <w:p>
-            <w:pPr>
-              <w:spacing w:after="40" w:line="252"/>
-              <w:jc w:val="left"/>
-            </w:pPr>
-            <w:r>
-              <w:rPr>
-                <w:rFonts w:ascii="Arial" w:cs="Arial" w:eastAsia="Arial" w:hAnsi="Arial"/>
-                <w:sz w:val="18"/>
-                <w:szCs w:val="18"/>
-              </w:rPr>
-              <w:t xml:space="preserve">Flat fee per campaign for a defined review scope, with a 48-hour standard turnaround</w:t>
-            </w:r>
-          </w:p>
-        </w:tc>
-      </w:tr>
-      <w:tr>
-        <w:trPr>
-          <w:cantSplit/>
-          <w:tblHeader w:val="false"/>
-        </w:trPr>
-        <w:tc>
-          <w:tcPr>
-            <w:tcW w:type="dxa" w:w="2500"/>
-            <w:shd w:fill="F2F2F2" w:color="auto" w:val="clear"/>
-            <w:tcMar>
-              <w:top w:type="dxa" w:w="70"/>
-              <w:left w:type="dxa" w:w="110"/>
-              <w:bottom w:type="dxa" w:w="70"/>
-              <w:right w:type="dxa" w:w="110"/>
-            </w:tcMar>
-            <w:vAlign w:val="top"/>
-          </w:tcPr>
-          <w:p>
-            <w:pPr>
-              <w:spacing w:after="40" w:line="252"/>
-              <w:jc w:val="left"/>
-            </w:pPr>
-            <w:r>
-              <w:rPr>
-                <w:rFonts w:ascii="Arial" w:cs="Arial" w:eastAsia="Arial" w:hAnsi="Arial"/>
-                <w:sz w:val="18"/>
-                <w:szCs w:val="18"/>
-              </w:rPr>
-              <w:t xml:space="preserve">F. Project fees for regulatory responses</w:t>
-            </w:r>
-          </w:p>
-        </w:tc>
-        <w:tc>
-          <w:tcPr>
-            <w:tcW w:type="dxa" w:w="2600"/>
-            <w:shd w:fill="F2F2F2" w:color="auto" w:val="clear"/>
-            <w:tcMar>
-              <w:top w:type="dxa" w:w="70"/>
-              <w:left w:type="dxa" w:w="110"/>
-              <w:bottom w:type="dxa" w:w="70"/>
-              <w:right w:type="dxa" w:w="110"/>
-            </w:tcMar>
-            <w:vAlign w:val="top"/>
-          </w:tcPr>
-          <w:p>
-            <w:pPr>
-              <w:spacing w:after="40" w:line="252"/>
-              <w:jc w:val="left"/>
-            </w:pPr>
-            <w:r>
-              <w:rPr>
-                <w:rFonts w:ascii="Arial" w:cs="Arial" w:eastAsia="Arial" w:hAnsi="Arial"/>
-                <w:sz w:val="18"/>
-                <w:szCs w:val="18"/>
-              </w:rPr>
-              <w:t xml:space="preserve">Regulator information requests and consultations</w:t>
-            </w:r>
-          </w:p>
-        </w:tc>
-        <w:tc>
-          <w:tcPr>
-            <w:tcW w:type="dxa" w:w="4260"/>
-            <w:shd w:fill="F2F2F2" w:color="auto" w:val="clear"/>
-            <w:tcMar>
-              <w:top w:type="dxa" w:w="70"/>
-              <w:left w:type="dxa" w:w="110"/>
-              <w:bottom w:type="dxa" w:w="70"/>
-              <w:right w:type="dxa" w:w="110"/>
-            </w:tcMar>
-            <w:vAlign w:val="top"/>
-          </w:tcPr>
-          <w:p>
-            <w:pPr>
-              <w:spacing w:after="40" w:line="252"/>
-              <w:jc w:val="left"/>
-            </w:pPr>
-            <w:r>
-              <w:rPr>
-                <w:rFonts w:ascii="Arial" w:cs="Arial" w:eastAsia="Arial" w:hAnsi="Arial"/>
-                <w:sz w:val="18"/>
-                <w:szCs w:val="18"/>
-              </w:rPr>
-              <w:t xml:space="preserve">Phase-based fixed fees agreed once the request is scoped; contentious phases billed with litigation task codes if a matter becomes adversarial</w:t>
+              <w:t xml:space="preserve">USD 450 per hour with a written estimate, a 75% budget alert and no estimate exceeded without prior approval.</w:t>
             </w:r>
           </w:p>
         </w:tc>
@@ -10499,7 +9711,7 @@
                 <w:sz w:val="19"/>
                 <w:szCs w:val="19"/>
               </w:rPr>
-              <w:t xml:space="preserve">Rates fixed for three years from 1 January 2027; litigation-matter rates fixed for the life of the matter (minimum three years) in accordance with the Guidelines</w:t>
+              <w:t xml:space="preserve">USD 450 per hour fixed for three years from 1 January 2027; litigation-matter rates fixed for the life of the matter (minimum three years) in accordance with the Guidelines</w:t>
             </w:r>
           </w:p>
         </w:tc>
@@ -10649,7 +9861,7 @@
           <w:sz w:val="21"/>
           <w:szCs w:val="21"/>
         </w:rPr>
-        <w:t xml:space="preserve">The spreadsheet contains a budget calculator that lets Netflix model spend under each option using its own volume assumptions. For illustration only, an engagement combining a mid-band advisory subscription, translation of 300,000 source words per year, twenty capped-fee contracts and fifteen patent filings would be expected to fall within a predictable annual range that we would be pleased to refine with Netflix during price negotiations in October.</w:t>
+        <w:t xml:space="preserve">The spreadsheet contains a budget calculator that lets Netflix model annual spend by workstream using its own volume assumptions, under the subscription, fixed-fee or hourly model. The illustrative figures in it are for modelling only and do not constitute a minimum commitment by Netflix. We would be pleased to refine them with Netflix during price negotiations in October.</w:t>
       </w:r>
     </w:p>
     <w:p>
@@ -11649,7 +10861,7 @@
           <w:szCs w:val="21"/>
           <w:shd w:fill="FFF200" w:color="auto" w:val="clear"/>
         </w:rPr>
-        <w:t xml:space="preserve">[Insert certifications held, e.g. ISO/IEC 27001, and the date of the most recent independent audit or penetration test.]</w:t>
+        <w:t xml:space="preserve">[Insert certifications held, e.g. ISO/IEC 27001, and the date of the most recent independent audit or penetration test. In progress.]</w:t>
       </w:r>
       <w:r>
         <w:rPr>
@@ -11806,7 +11018,7 @@
                 <w:szCs w:val="19"/>
                 <w:shd w:fill="FFF200" w:color="auto" w:val="clear"/>
               </w:rPr>
-              <w:t xml:space="preserve">[Chief Information Security Officer name]</w:t>
+              <w:t xml:space="preserve">[Security Point of Contact name]</w:t>
             </w:r>
             <w:r>
               <w:rPr>
@@ -12091,16 +11303,7 @@
           <w:sz w:val="21"/>
           <w:szCs w:val="21"/>
         </w:rPr>
-        <w:t xml:space="preserve"> A preliminary conflicts review against the scope of this RFP has identified no conflict that would prevent Dentons KMN from acting for Netflix. We will run a full check at engagement and on every new matter, disclose any actual or potential conflict promptly, and will not seek advance, general or litigation waivers. </w:t>
-      </w:r>
-      <w:r>
-        <w:rPr>
-          <w:rFonts w:ascii="Arial" w:cs="Arial" w:eastAsia="Arial" w:hAnsi="Arial"/>
-          <w:sz w:val="21"/>
-          <w:szCs w:val="21"/>
-          <w:shd w:fill="FFF200" w:color="auto" w:val="clear"/>
-        </w:rPr>
-        <w:t xml:space="preserve">[Confirm the outcome of the firm-wide conflicts check before submission.]</w:t>
+        <w:t xml:space="preserve"> Our conflicts review against the scope of this RFP has identified no conflict that would prevent Dentons KMN from acting for Netflix. We will run a check on every new matter, disclose any actual or potential conflict promptly, and will not seek advance, general or litigation waivers.</w:t>
       </w:r>
     </w:p>
     <w:p>
@@ -12221,7 +11424,7 @@
           <w:szCs w:val="21"/>
           <w:shd w:fill="FFF200" w:color="auto" w:val="clear"/>
         </w:rPr>
-        <w:t xml:space="preserve">[Insert insurer, limit of indemnity and policy year.]</w:t>
+        <w:t xml:space="preserve">[Insert insurer, limit of indemnity and policy year. In progress.]</w:t>
       </w:r>
     </w:p>
     <w:p>
@@ -13492,9 +12695,8 @@
           <w:bCs/>
           <w:sz w:val="21"/>
           <w:szCs w:val="21"/>
-          <w:shd w:fill="FFF200" w:color="auto" w:val="clear"/>
-        </w:rPr>
-        <w:t xml:space="preserve">[Relationship Partner name]</w:t>
+        </w:rPr>
+        <w:t xml:space="preserve">Agbor Nkongho</w:t>
       </w:r>
     </w:p>
     <w:p>
@@ -16045,9 +15247,8 @@
                 <w:rFonts w:ascii="Arial" w:cs="Arial" w:eastAsia="Arial" w:hAnsi="Arial"/>
                 <w:sz w:val="18"/>
                 <w:szCs w:val="18"/>
-                <w:shd w:fill="FFF200" w:color="auto" w:val="clear"/>
-              </w:rPr>
-              <w:t xml:space="preserve">[Relationship Partner name]</w:t>
+              </w:rPr>
+              <w:t xml:space="preserve">Agbor Nkongho</w:t>
             </w:r>
           </w:p>
         </w:tc>
@@ -16072,9 +15273,8 @@
                 <w:rFonts w:ascii="Arial" w:cs="Arial" w:eastAsia="Arial" w:hAnsi="Arial"/>
                 <w:sz w:val="18"/>
                 <w:szCs w:val="18"/>
-                <w:shd w:fill="FFF200" w:color="auto" w:val="clear"/>
-              </w:rPr>
-              <w:t xml:space="preserve">[email@dentons.com]</w:t>
+              </w:rPr>
+              <w:t xml:space="preserve">nkongho.agbor@dentons.com</w:t>
             </w:r>
           </w:p>
         </w:tc>
@@ -16099,9 +15299,8 @@
                 <w:rFonts w:ascii="Arial" w:cs="Arial" w:eastAsia="Arial" w:hAnsi="Arial"/>
                 <w:sz w:val="18"/>
                 <w:szCs w:val="18"/>
-                <w:shd w:fill="FFF200" w:color="auto" w:val="clear"/>
-              </w:rPr>
-              <w:t xml:space="preserve">[+00 000 000 0000]</w:t>
+              </w:rPr>
+              <w:t xml:space="preserve">+237 650 73 21 70</w:t>
             </w:r>
           </w:p>
         </w:tc>
@@ -16134,7 +15333,7 @@
                 <w:sz w:val="18"/>
                 <w:szCs w:val="18"/>
               </w:rPr>
-              <w:t xml:space="preserve">Privacy &amp; Data Lead</w:t>
+              <w:t xml:space="preserve">Compliance Lead</w:t>
             </w:r>
           </w:p>
         </w:tc>
@@ -16162,7 +15361,7 @@
                 <w:szCs w:val="18"/>
                 <w:shd w:fill="FFF200" w:color="auto" w:val="clear"/>
               </w:rPr>
-              <w:t xml:space="preserve">[Privacy &amp; Data Lead name]</w:t>
+              <w:t xml:space="preserve">[Compliance Lead name]</w:t>
             </w:r>
           </w:p>
         </w:tc>
@@ -16250,7 +15449,7 @@
                 <w:sz w:val="18"/>
                 <w:szCs w:val="18"/>
               </w:rPr>
-              <w:t xml:space="preserve">Consumer Protection &amp; Marketing Lead</w:t>
+              <w:t xml:space="preserve">Legal Advisory Lead (incl. Translation &amp; Localization Desk)</w:t>
             </w:r>
           </w:p>
         </w:tc>
@@ -16277,7 +15476,7 @@
                 <w:szCs w:val="18"/>
                 <w:shd w:fill="FFF200" w:color="auto" w:val="clear"/>
               </w:rPr>
-              <w:t xml:space="preserve">[Consumer &amp; Marketing Lead name]</w:t>
+              <w:t xml:space="preserve">[Legal Advisory Lead name]</w:t>
             </w:r>
           </w:p>
         </w:tc>
@@ -16364,7 +15563,7 @@
                 <w:sz w:val="18"/>
                 <w:szCs w:val="18"/>
               </w:rPr>
-              <w:t xml:space="preserve">Patents &amp; IP Lead</w:t>
+              <w:t xml:space="preserve">Corporate/M&amp;A Lead</w:t>
             </w:r>
           </w:p>
         </w:tc>
@@ -16392,7 +15591,7 @@
                 <w:szCs w:val="18"/>
                 <w:shd w:fill="FFF200" w:color="auto" w:val="clear"/>
               </w:rPr>
-              <w:t xml:space="preserve">[Patents &amp; IP Lead name]</w:t>
+              <w:t xml:space="preserve">[Corporate/M&amp;A Lead name]</w:t>
             </w:r>
           </w:p>
         </w:tc>
@@ -16480,7 +15679,7 @@
                 <w:sz w:val="18"/>
                 <w:szCs w:val="18"/>
               </w:rPr>
-              <w:t xml:space="preserve">Product Contracts &amp; Commercial Lead</w:t>
+              <w:t xml:space="preserve">Energy &amp; PPP Lead</w:t>
             </w:r>
           </w:p>
         </w:tc>
@@ -16507,7 +15706,7 @@
                 <w:szCs w:val="18"/>
                 <w:shd w:fill="FFF200" w:color="auto" w:val="clear"/>
               </w:rPr>
-              <w:t xml:space="preserve">[Product Contracts Lead name]</w:t>
+              <w:t xml:space="preserve">[Energy &amp; PPP Lead name]</w:t>
             </w:r>
           </w:p>
         </w:tc>
@@ -16594,7 +15793,7 @@
                 <w:sz w:val="18"/>
                 <w:szCs w:val="18"/>
               </w:rPr>
-              <w:t xml:space="preserve">Translation &amp; Localization Desk Lead</w:t>
+              <w:t xml:space="preserve">Banking &amp; Finance Lead</w:t>
             </w:r>
           </w:p>
         </w:tc>
@@ -16622,7 +15821,7 @@
                 <w:szCs w:val="18"/>
                 <w:shd w:fill="FFF200" w:color="auto" w:val="clear"/>
               </w:rPr>
-              <w:t xml:space="preserve">[Translation Desk Lead name]</w:t>
+              <w:t xml:space="preserve">[Banking &amp; Finance Lead name]</w:t>
             </w:r>
           </w:p>
         </w:tc>
@@ -16710,7 +15909,7 @@
                 <w:sz w:val="18"/>
                 <w:szCs w:val="18"/>
               </w:rPr>
-              <w:t xml:space="preserve">Client Service &amp; Billing Manager (Legal Tracker)</w:t>
+              <w:t xml:space="preserve">Dentons global IP &amp; Patents Lead</w:t>
             </w:r>
           </w:p>
         </w:tc>
@@ -16737,7 +15936,7 @@
                 <w:szCs w:val="18"/>
                 <w:shd w:fill="FFF200" w:color="auto" w:val="clear"/>
               </w:rPr>
-              <w:t xml:space="preserve">[Client Service / Billing Manager name]</w:t>
+              <w:t xml:space="preserve">[Dentons global IP &amp; Patents Lead name and office]</w:t>
             </w:r>
           </w:p>
         </w:tc>
@@ -16764,7 +15963,7 @@
                 <w:szCs w:val="18"/>
                 <w:shd w:fill="FFF200" w:color="auto" w:val="clear"/>
               </w:rPr>
-              <w:t xml:space="preserve">[billing@dentons.com]</w:t>
+              <w:t xml:space="preserve">[…]</w:t>
             </w:r>
           </w:p>
         </w:tc>
@@ -16824,7 +16023,7 @@
                 <w:sz w:val="18"/>
                 <w:szCs w:val="18"/>
               </w:rPr>
-              <w:t xml:space="preserve">Security Point of Contact</w:t>
+              <w:t xml:space="preserve">Client Service &amp; Billing Manager (Legal Tracker)</w:t>
             </w:r>
           </w:p>
         </w:tc>
@@ -16850,9 +16049,8 @@
                 <w:rFonts w:ascii="Arial" w:cs="Arial" w:eastAsia="Arial" w:hAnsi="Arial"/>
                 <w:sz w:val="18"/>
                 <w:szCs w:val="18"/>
-                <w:shd w:fill="FFF200" w:color="auto" w:val="clear"/>
-              </w:rPr>
-              <w:t xml:space="preserve">[Chief Information Security Officer name]</w:t>
+              </w:rPr>
+              <w:t xml:space="preserve">Christian Ekwe</w:t>
             </w:r>
           </w:p>
         </w:tc>
@@ -16878,9 +16076,8 @@
                 <w:rFonts w:ascii="Arial" w:cs="Arial" w:eastAsia="Arial" w:hAnsi="Arial"/>
                 <w:sz w:val="18"/>
                 <w:szCs w:val="18"/>
-                <w:shd w:fill="FFF200" w:color="auto" w:val="clear"/>
-              </w:rPr>
-              <w:t xml:space="preserve">[security@dentons.com]</w:t>
+              </w:rPr>
+              <w:t xml:space="preserve">christian.ekwe@dentons.com</w:t>
             </w:r>
           </w:p>
         </w:tc>
@@ -16913,6 +16110,119 @@
           </w:p>
         </w:tc>
       </w:tr>
+      <w:tr>
+        <w:trPr>
+          <w:cantSplit/>
+          <w:tblHeader w:val="false"/>
+        </w:trPr>
+        <w:tc>
+          <w:tcPr>
+            <w:tcW w:type="dxa" w:w="3000"/>
+            <w:tcMar>
+              <w:top w:type="dxa" w:w="70"/>
+              <w:left w:type="dxa" w:w="110"/>
+              <w:bottom w:type="dxa" w:w="70"/>
+              <w:right w:type="dxa" w:w="110"/>
+            </w:tcMar>
+            <w:vAlign w:val="top"/>
+          </w:tcPr>
+          <w:p>
+            <w:pPr>
+              <w:spacing w:after="40" w:line="252"/>
+              <w:jc w:val="left"/>
+            </w:pPr>
+            <w:r>
+              <w:rPr>
+                <w:rFonts w:ascii="Arial" w:cs="Arial" w:eastAsia="Arial" w:hAnsi="Arial"/>
+                <w:sz w:val="18"/>
+                <w:szCs w:val="18"/>
+              </w:rPr>
+              <w:t xml:space="preserve">Security Point of Contact</w:t>
+            </w:r>
+          </w:p>
+        </w:tc>
+        <w:tc>
+          <w:tcPr>
+            <w:tcW w:type="dxa" w:w="2300"/>
+            <w:tcMar>
+              <w:top w:type="dxa" w:w="70"/>
+              <w:left w:type="dxa" w:w="110"/>
+              <w:bottom w:type="dxa" w:w="70"/>
+              <w:right w:type="dxa" w:w="110"/>
+            </w:tcMar>
+            <w:vAlign w:val="top"/>
+          </w:tcPr>
+          <w:p>
+            <w:pPr>
+              <w:spacing w:after="40" w:line="252"/>
+              <w:jc w:val="left"/>
+            </w:pPr>
+            <w:r>
+              <w:rPr>
+                <w:rFonts w:ascii="Arial" w:cs="Arial" w:eastAsia="Arial" w:hAnsi="Arial"/>
+                <w:sz w:val="18"/>
+                <w:szCs w:val="18"/>
+                <w:shd w:fill="FFF200" w:color="auto" w:val="clear"/>
+              </w:rPr>
+              <w:t xml:space="preserve">[Security Point of Contact name]</w:t>
+            </w:r>
+          </w:p>
+        </w:tc>
+        <w:tc>
+          <w:tcPr>
+            <w:tcW w:type="dxa" w:w="2400"/>
+            <w:tcMar>
+              <w:top w:type="dxa" w:w="70"/>
+              <w:left w:type="dxa" w:w="110"/>
+              <w:bottom w:type="dxa" w:w="70"/>
+              <w:right w:type="dxa" w:w="110"/>
+            </w:tcMar>
+            <w:vAlign w:val="top"/>
+          </w:tcPr>
+          <w:p>
+            <w:pPr>
+              <w:spacing w:after="40" w:line="252"/>
+              <w:jc w:val="left"/>
+            </w:pPr>
+            <w:r>
+              <w:rPr>
+                <w:rFonts w:ascii="Arial" w:cs="Arial" w:eastAsia="Arial" w:hAnsi="Arial"/>
+                <w:sz w:val="18"/>
+                <w:szCs w:val="18"/>
+                <w:shd w:fill="FFF200" w:color="auto" w:val="clear"/>
+              </w:rPr>
+              <w:t xml:space="preserve">[security contact email]</w:t>
+            </w:r>
+          </w:p>
+        </w:tc>
+        <w:tc>
+          <w:tcPr>
+            <w:tcW w:type="dxa" w:w="1660"/>
+            <w:tcMar>
+              <w:top w:type="dxa" w:w="70"/>
+              <w:left w:type="dxa" w:w="110"/>
+              <w:bottom w:type="dxa" w:w="70"/>
+              <w:right w:type="dxa" w:w="110"/>
+            </w:tcMar>
+            <w:vAlign w:val="top"/>
+          </w:tcPr>
+          <w:p>
+            <w:pPr>
+              <w:spacing w:after="40" w:line="252"/>
+              <w:jc w:val="left"/>
+            </w:pPr>
+            <w:r>
+              <w:rPr>
+                <w:rFonts w:ascii="Arial" w:cs="Arial" w:eastAsia="Arial" w:hAnsi="Arial"/>
+                <w:sz w:val="18"/>
+                <w:szCs w:val="18"/>
+                <w:shd w:fill="FFF200" w:color="auto" w:val="clear"/>
+              </w:rPr>
+              <w:t xml:space="preserve">[…]</w:t>
+            </w:r>
+          </w:p>
+        </w:tc>
+      </w:tr>
     </w:tbl>
     <w:p>
       <w:pPr>
@@ -16930,16 +16240,21 @@
           <w:sz w:val="21"/>
           <w:szCs w:val="21"/>
         </w:rPr>
-        <w:t xml:space="preserve">Registered office: </w:t>
-      </w:r>
-      <w:r>
-        <w:rPr>
-          <w:rFonts w:ascii="Arial" w:cs="Arial" w:eastAsia="Arial" w:hAnsi="Arial"/>
-          <w:sz w:val="21"/>
-          <w:szCs w:val="21"/>
-          <w:shd w:fill="FFF200" w:color="auto" w:val="clear"/>
-        </w:rPr>
-        <w:t xml:space="preserve">[Street address, City, Country]</w:t>
+        <w:t xml:space="preserve">Dentons KMN (Kouengoua Minou Nkongho), Attorneys at Law</w:t>
+      </w:r>
+    </w:p>
+    <w:p>
+      <w:pPr>
+        <w:spacing w:after="140" w:line="276"/>
+        <w:jc w:val="left"/>
+      </w:pPr>
+      <w:r>
+        <w:rPr>
+          <w:rFonts w:ascii="Arial" w:cs="Arial" w:eastAsia="Arial" w:hAnsi="Arial"/>
+          <w:sz w:val="21"/>
+          <w:szCs w:val="21"/>
+        </w:rPr>
+        <w:t xml:space="preserve">P.O. Box 3792, 485 Rue des Ecoles, Akwa, Douala, Cameroon</w:t>
       </w:r>
     </w:p>
     <w:sectPr>

</xml_diff>